<commit_message>
AUC 81 gradient boost with good scientific method
</commit_message>
<xml_diff>
--- a/PDL1_Manuscript.docx
+++ b/PDL1_Manuscript.docx
@@ -4500,6 +4500,84 @@
           <w:rFonts w:ascii="Times New Roman" w:hAnsi="Times New Roman" w:cs="Times New Roman"/>
         </w:rPr>
         <w:t xml:space="preserve"> or combination therapy at any other time. </w:t>
+      </w:r>
+    </w:p>
+    <w:p>
+      <w:pPr>
+        <w:rPr>
+          <w:rFonts w:ascii="Times New Roman" w:hAnsi="Times New Roman" w:cs="Times New Roman"/>
+        </w:rPr>
+      </w:pPr>
+    </w:p>
+    <w:p>
+      <w:pPr>
+        <w:rPr>
+          <w:rFonts w:ascii="Times New Roman" w:hAnsi="Times New Roman" w:cs="Times New Roman"/>
+        </w:rPr>
+      </w:pPr>
+      <w:r>
+        <w:rPr>
+          <w:rFonts w:ascii="Times New Roman" w:hAnsi="Times New Roman" w:cs="Times New Roman"/>
+        </w:rPr>
+        <w:t xml:space="preserve">The threshold we </w:t>
+      </w:r>
+      <w:r>
+        <w:rPr>
+          <w:rFonts w:ascii="Times New Roman" w:hAnsi="Times New Roman" w:cs="Times New Roman"/>
+        </w:rPr>
+        <w:t>selected for classifying predictions as positive progression or negative progression used the Youden index, which selects the prediction threshold that “</w:t>
+      </w:r>
+      <w:r>
+        <w:rPr>
+          <w:rFonts w:ascii="Times New Roman" w:hAnsi="Times New Roman" w:cs="Times New Roman"/>
+          <w:color w:val="212121"/>
+          <w:shd w:val="clear" w:color="auto" w:fill="FFFFFF"/>
+        </w:rPr>
+        <w:t>optimizes the biomarker’s differentiating ability when equal weight is given to sensitivity and specificity</w:t>
+      </w:r>
+      <w:r>
+        <w:rPr>
+          <w:rFonts w:ascii="Times New Roman" w:hAnsi="Times New Roman" w:cs="Times New Roman"/>
+        </w:rPr>
+        <w:t>”</w:t>
+      </w:r>
+      <w:r>
+        <w:rPr>
+          <w:rFonts w:ascii="Times New Roman" w:hAnsi="Times New Roman" w:cs="Times New Roman"/>
+        </w:rPr>
+        <w:fldChar w:fldCharType="begin"/>
+      </w:r>
+      <w:r>
+        <w:rPr>
+          <w:rFonts w:ascii="Times New Roman" w:hAnsi="Times New Roman" w:cs="Times New Roman"/>
+        </w:rPr>
+        <w:instrText xml:space="preserve"> ADDIN ZOTERO_ITEM CSL_CITATION {"citationID":"VjipVLFj","properties":{"formattedCitation":"\\super 22,23\\nosupersub{}","plainCitation":"22,23","noteIndex":0},"citationItems":[{"id":485,"uris":["http://zotero.org/users/12114985/items/5H3TA7LC"],"itemData":{"id":485,"type":"article-journal","container-title":"Cancer","DOI":"10.1002/1097-0142(1950)3:1&lt;32::aid-cncr2820030106&gt;3.0.co;2-3","ISSN":"0008-543X","issue":"1","journalAbbreviation":"Cancer","language":"eng","note":"PMID: 15405679","page":"32-35","source":"PubMed","title":"Index for rating diagnostic tests","volume":"3","author":[{"family":"Youden","given":"W. J."}],"issued":{"date-parts":[["1950",1]]}}},{"id":487,"uris":["http://zotero.org/users/12114985/items/IY5PPX6Z"],"itemData":{"id":487,"type":"article-journal","abstract":"The receiver operating characteristic (ROC) curve is used to evaluate a biomarker’s ability for classifying disease status. The Youden Index (J), the maximum potential effectiveness of a biomarker, is a common summary measure of the ROC curve. In biomarker development, levels may be unquantifiable below a limit of detection (LOD) and missing from the overall dataset. Disregarding these observations may negatively bias the ROC curve and thus J. Several correction methods have been suggested for mean estimation and testing; however, little has been written about the ROC curve or its summary measures. We adapt non-parametric (empirical) and semi-parametric (ROC-GLM [generalized linear model]) methods and propose parametric methods (maximum likelihood (ML)) to estimate J and the optimal cut-point (c*) for a biomarker affected by a LOD. We develop unbiased estimators of J and c* via ML for normally and gamma distributed biomarkers. Alpha level confidence intervals are proposed using delta and bootstrap methods for the ML, semi-parametric, and non-parametric approaches respectively. Simulation studies are conducted over a range of distributional scenarios and sample sizes evaluating estimators’ bias, root-mean square error, and coverage probability; the average bias was less than one percent for ML and GLM methods across scenarios and decreases with increased sample size. An example using polychlorinated biphenyl levels to classify women with and without endometriosis illustrates the potential benefits of these methods. We address the limitations and usefulness of each method in order to give researchers guidance in constructing appropriate estimates of biomarkers’ true discriminating capabilities.","container-title":"Biometrical journal. Biometrische Zeitschrift","DOI":"10.1002/bimj.200710415","ISSN":"0323-3847","issue":"3","journalAbbreviation":"Biom J","note":"PMID: 18435502\nPMCID: PMC2515362","page":"419-430","source":"PubMed Central","title":"Youden Index and Optimal Cut-Point Estimated from Observations Affected by a Lower Limit of Detection","volume":"50","author":[{"family":"Ruopp","given":"Marcus D."},{"family":"Perkins","given":"Neil J."},{"family":"Whitcomb","given":"Brian W."},{"family":"Schisterman","given":"Enrique F."}],"issued":{"date-parts":[["2008",6]]}}}],"schema":"https://github.com/citation-style-language/schema/raw/master/csl-citation.json"} </w:instrText>
+      </w:r>
+      <w:r>
+        <w:rPr>
+          <w:rFonts w:ascii="Times New Roman" w:hAnsi="Times New Roman" w:cs="Times New Roman"/>
+        </w:rPr>
+        <w:fldChar w:fldCharType="separate"/>
+      </w:r>
+      <w:r>
+        <w:rPr>
+          <w:rFonts w:ascii="Times New Roman" w:hAnsi="Times New Roman" w:cs="Times New Roman"/>
+          <w:kern w:val="0"/>
+          <w:vertAlign w:val="superscript"/>
+        </w:rPr>
+        <w:t>22,23</w:t>
+      </w:r>
+      <w:r>
+        <w:rPr>
+          <w:rFonts w:ascii="Times New Roman" w:hAnsi="Times New Roman" w:cs="Times New Roman"/>
+        </w:rPr>
+        <w:fldChar w:fldCharType="end"/>
+      </w:r>
+      <w:r>
+        <w:rPr>
+          <w:rFonts w:ascii="Times New Roman" w:hAnsi="Times New Roman" w:cs="Times New Roman"/>
+        </w:rPr>
+        <w:t>.</w:t>
       </w:r>
     </w:p>
     <w:p>
@@ -5662,6 +5740,7 @@
                 <w:sz w:val="21"/>
                 <w:szCs w:val="21"/>
               </w:rPr>
+              <w:lastRenderedPageBreak/>
               <w:t>Unknown</w:t>
             </w:r>
           </w:p>
@@ -5899,7 +5978,6 @@
                 <w:sz w:val="21"/>
                 <w:szCs w:val="21"/>
               </w:rPr>
-              <w:lastRenderedPageBreak/>
               <w:t>Asian</w:t>
             </w:r>
           </w:p>
@@ -8737,6 +8815,7 @@
                 <w:sz w:val="21"/>
                 <w:szCs w:val="21"/>
               </w:rPr>
+              <w:lastRenderedPageBreak/>
               <w:t>ALK+</w:t>
             </w:r>
           </w:p>
@@ -11323,6 +11402,7 @@
           <w:b/>
           <w:bCs/>
         </w:rPr>
+        <w:lastRenderedPageBreak/>
         <w:t>Data Availability</w:t>
       </w:r>
     </w:p>
@@ -11391,7 +11471,6 @@
         <w:rPr>
           <w:rFonts w:ascii="Times New Roman" w:hAnsi="Times New Roman" w:cs="Times New Roman"/>
         </w:rPr>
-        <w:lastRenderedPageBreak/>
         <w:t xml:space="preserve">Development of the ML model was done in Python v3.8.10 and required the following packages: ***. Statistical analysis was done in Stata. Code is available on GitHub at </w:t>
       </w:r>
       <w:hyperlink r:id="rId6" w:history="1">
@@ -11553,7 +11632,21 @@
           <w:rFonts w:ascii="Times New Roman" w:hAnsi="Times New Roman" w:cs="Times New Roman"/>
         </w:rPr>
         <w:tab/>
-        <w:t xml:space="preserve">Yu H, Boyle TA, Zhou C, Rimm DL, Hirsch FR. PD-L1 Expression in Lung Cancer. </w:t>
+        <w:t xml:space="preserve">Yu H, Boyle TA, Zhou C, </w:t>
+      </w:r>
+      <w:proofErr w:type="spellStart"/>
+      <w:r>
+        <w:rPr>
+          <w:rFonts w:ascii="Times New Roman" w:hAnsi="Times New Roman" w:cs="Times New Roman"/>
+        </w:rPr>
+        <w:t>Rimm</w:t>
+      </w:r>
+      <w:proofErr w:type="spellEnd"/>
+      <w:r>
+        <w:rPr>
+          <w:rFonts w:ascii="Times New Roman" w:hAnsi="Times New Roman" w:cs="Times New Roman"/>
+        </w:rPr>
+        <w:t xml:space="preserve"> DL, Hirsch FR. PD-L1 Expression in Lung Cancer. </w:t>
       </w:r>
       <w:r>
         <w:rPr>
@@ -11561,146 +11654,358 @@
           <w:i/>
           <w:iCs/>
         </w:rPr>
-        <w:t>J Thorac Oncol Off Publ Int Assoc Study Lung Cancer</w:t>
-      </w:r>
-      <w:r>
-        <w:rPr>
-          <w:rFonts w:ascii="Times New Roman" w:hAnsi="Times New Roman" w:cs="Times New Roman"/>
-        </w:rPr>
-        <w:t>. 2016;11(7):964-975. doi:10.1016/j.jtho.2016.04.014</w:t>
-      </w:r>
-    </w:p>
-    <w:p>
-      <w:pPr>
-        <w:pStyle w:val="Bibliography"/>
-        <w:rPr>
-          <w:rFonts w:ascii="Times New Roman" w:hAnsi="Times New Roman" w:cs="Times New Roman"/>
-        </w:rPr>
-      </w:pPr>
-      <w:r>
-        <w:rPr>
-          <w:rFonts w:ascii="Times New Roman" w:hAnsi="Times New Roman" w:cs="Times New Roman"/>
-        </w:rPr>
-        <w:t>2.</w:t>
-      </w:r>
-      <w:r>
-        <w:rPr>
-          <w:rFonts w:ascii="Times New Roman" w:hAnsi="Times New Roman" w:cs="Times New Roman"/>
-        </w:rPr>
-        <w:tab/>
-        <w:t xml:space="preserve">Oun R, Moussa YE, Wheate NJ. The side effects of platinum-based chemotherapy drugs: a review for chemists. </w:t>
-      </w:r>
+        <w:t xml:space="preserve">J </w:t>
+      </w:r>
+      <w:proofErr w:type="spellStart"/>
       <w:r>
         <w:rPr>
           <w:rFonts w:ascii="Times New Roman" w:hAnsi="Times New Roman" w:cs="Times New Roman"/>
           <w:i/>
           <w:iCs/>
         </w:rPr>
-        <w:t>Dalton Trans Camb Engl 2003</w:t>
-      </w:r>
-      <w:r>
-        <w:rPr>
-          <w:rFonts w:ascii="Times New Roman" w:hAnsi="Times New Roman" w:cs="Times New Roman"/>
-        </w:rPr>
-        <w:t>. 2018;47(19):6645-6653. doi:10.1039/c8dt00838h</w:t>
-      </w:r>
-    </w:p>
-    <w:p>
-      <w:pPr>
-        <w:pStyle w:val="Bibliography"/>
-        <w:rPr>
-          <w:rFonts w:ascii="Times New Roman" w:hAnsi="Times New Roman" w:cs="Times New Roman"/>
-        </w:rPr>
-      </w:pPr>
-      <w:r>
-        <w:rPr>
-          <w:rFonts w:ascii="Times New Roman" w:hAnsi="Times New Roman" w:cs="Times New Roman"/>
-        </w:rPr>
-        <w:t>3.</w:t>
-      </w:r>
-      <w:r>
-        <w:rPr>
-          <w:rFonts w:ascii="Times New Roman" w:hAnsi="Times New Roman" w:cs="Times New Roman"/>
-        </w:rPr>
-        <w:tab/>
-        <w:t xml:space="preserve">Lahiri A, Maji A, Potdar PD, et al. Lung cancer immunotherapy: progress, pitfalls, and promises. </w:t>
-      </w:r>
+        <w:t>Thorac</w:t>
+      </w:r>
+      <w:proofErr w:type="spellEnd"/>
       <w:r>
         <w:rPr>
           <w:rFonts w:ascii="Times New Roman" w:hAnsi="Times New Roman" w:cs="Times New Roman"/>
           <w:i/>
           <w:iCs/>
         </w:rPr>
-        <w:t>Mol Cancer</w:t>
-      </w:r>
-      <w:r>
-        <w:rPr>
-          <w:rFonts w:ascii="Times New Roman" w:hAnsi="Times New Roman" w:cs="Times New Roman"/>
-        </w:rPr>
-        <w:t>. 2023;22:40. doi:10.1186/s12943-023-01740-y</w:t>
-      </w:r>
-    </w:p>
-    <w:p>
-      <w:pPr>
-        <w:pStyle w:val="Bibliography"/>
-        <w:rPr>
-          <w:rFonts w:ascii="Times New Roman" w:hAnsi="Times New Roman" w:cs="Times New Roman"/>
-        </w:rPr>
-      </w:pPr>
-      <w:r>
-        <w:rPr>
-          <w:rFonts w:ascii="Times New Roman" w:hAnsi="Times New Roman" w:cs="Times New Roman"/>
-        </w:rPr>
-        <w:t>4.</w:t>
-      </w:r>
-      <w:r>
-        <w:rPr>
-          <w:rFonts w:ascii="Times New Roman" w:hAnsi="Times New Roman" w:cs="Times New Roman"/>
-        </w:rPr>
-        <w:tab/>
-        <w:t xml:space="preserve">Garon EB, Rizvi NA, Hui R, et al. Pembrolizumab for the treatment of non-small-cell lung cancer. </w:t>
-      </w:r>
+        <w:t xml:space="preserve"> Oncol Off </w:t>
+      </w:r>
+      <w:proofErr w:type="spellStart"/>
       <w:r>
         <w:rPr>
           <w:rFonts w:ascii="Times New Roman" w:hAnsi="Times New Roman" w:cs="Times New Roman"/>
           <w:i/>
           <w:iCs/>
         </w:rPr>
-        <w:t>N Engl J Med</w:t>
-      </w:r>
-      <w:r>
-        <w:rPr>
-          <w:rFonts w:ascii="Times New Roman" w:hAnsi="Times New Roman" w:cs="Times New Roman"/>
-        </w:rPr>
-        <w:t>. 2015;372(21):2018-2028. doi:10.1056/NEJMoa1501824</w:t>
-      </w:r>
-    </w:p>
-    <w:p>
-      <w:pPr>
-        <w:pStyle w:val="Bibliography"/>
-        <w:rPr>
-          <w:rFonts w:ascii="Times New Roman" w:hAnsi="Times New Roman" w:cs="Times New Roman"/>
-        </w:rPr>
-      </w:pPr>
-      <w:r>
-        <w:rPr>
-          <w:rFonts w:ascii="Times New Roman" w:hAnsi="Times New Roman" w:cs="Times New Roman"/>
-        </w:rPr>
-        <w:t>5.</w:t>
-      </w:r>
-      <w:r>
-        <w:rPr>
-          <w:rFonts w:ascii="Times New Roman" w:hAnsi="Times New Roman" w:cs="Times New Roman"/>
-        </w:rPr>
-        <w:tab/>
-        <w:t xml:space="preserve">Brahmer JR, Drake CG, Wollner I, et al. Phase I study of single-agent anti-programmed death-1 (MDX-1106) in refractory solid tumors: safety, clinical activity, pharmacodynamics, and immunologic correlates. </w:t>
-      </w:r>
+        <w:t>Publ</w:t>
+      </w:r>
+      <w:proofErr w:type="spellEnd"/>
       <w:r>
         <w:rPr>
           <w:rFonts w:ascii="Times New Roman" w:hAnsi="Times New Roman" w:cs="Times New Roman"/>
           <w:i/>
           <w:iCs/>
         </w:rPr>
+        <w:t xml:space="preserve"> Int Assoc Study Lung Cancer</w:t>
+      </w:r>
+      <w:r>
+        <w:rPr>
+          <w:rFonts w:ascii="Times New Roman" w:hAnsi="Times New Roman" w:cs="Times New Roman"/>
+        </w:rPr>
+        <w:t xml:space="preserve">. 2016;11(7):964-975. </w:t>
+      </w:r>
+      <w:proofErr w:type="gramStart"/>
+      <w:r>
+        <w:rPr>
+          <w:rFonts w:ascii="Times New Roman" w:hAnsi="Times New Roman" w:cs="Times New Roman"/>
+        </w:rPr>
+        <w:t>doi:10.1016/j.jtho</w:t>
+      </w:r>
+      <w:proofErr w:type="gramEnd"/>
+      <w:r>
+        <w:rPr>
+          <w:rFonts w:ascii="Times New Roman" w:hAnsi="Times New Roman" w:cs="Times New Roman"/>
+        </w:rPr>
+        <w:t>.2016.04.014</w:t>
+      </w:r>
+    </w:p>
+    <w:p>
+      <w:pPr>
+        <w:pStyle w:val="Bibliography"/>
+        <w:rPr>
+          <w:rFonts w:ascii="Times New Roman" w:hAnsi="Times New Roman" w:cs="Times New Roman"/>
+        </w:rPr>
+      </w:pPr>
+      <w:r>
+        <w:rPr>
+          <w:rFonts w:ascii="Times New Roman" w:hAnsi="Times New Roman" w:cs="Times New Roman"/>
+        </w:rPr>
+        <w:t>2.</w:t>
+      </w:r>
+      <w:r>
+        <w:rPr>
+          <w:rFonts w:ascii="Times New Roman" w:hAnsi="Times New Roman" w:cs="Times New Roman"/>
+        </w:rPr>
+        <w:tab/>
+      </w:r>
+      <w:proofErr w:type="spellStart"/>
+      <w:r>
+        <w:rPr>
+          <w:rFonts w:ascii="Times New Roman" w:hAnsi="Times New Roman" w:cs="Times New Roman"/>
+        </w:rPr>
+        <w:t>Oun</w:t>
+      </w:r>
+      <w:proofErr w:type="spellEnd"/>
+      <w:r>
+        <w:rPr>
+          <w:rFonts w:ascii="Times New Roman" w:hAnsi="Times New Roman" w:cs="Times New Roman"/>
+        </w:rPr>
+        <w:t xml:space="preserve"> R, Moussa YE, </w:t>
+      </w:r>
+      <w:proofErr w:type="spellStart"/>
+      <w:r>
+        <w:rPr>
+          <w:rFonts w:ascii="Times New Roman" w:hAnsi="Times New Roman" w:cs="Times New Roman"/>
+        </w:rPr>
+        <w:t>Wheate</w:t>
+      </w:r>
+      <w:proofErr w:type="spellEnd"/>
+      <w:r>
+        <w:rPr>
+          <w:rFonts w:ascii="Times New Roman" w:hAnsi="Times New Roman" w:cs="Times New Roman"/>
+        </w:rPr>
+        <w:t xml:space="preserve"> NJ. The side effects of platinum-based chemotherapy drugs: a review for chemists. </w:t>
+      </w:r>
+      <w:r>
+        <w:rPr>
+          <w:rFonts w:ascii="Times New Roman" w:hAnsi="Times New Roman" w:cs="Times New Roman"/>
+          <w:i/>
+          <w:iCs/>
+        </w:rPr>
+        <w:t xml:space="preserve">Dalton Trans </w:t>
+      </w:r>
+      <w:proofErr w:type="spellStart"/>
+      <w:r>
+        <w:rPr>
+          <w:rFonts w:ascii="Times New Roman" w:hAnsi="Times New Roman" w:cs="Times New Roman"/>
+          <w:i/>
+          <w:iCs/>
+        </w:rPr>
+        <w:t>Camb</w:t>
+      </w:r>
+      <w:proofErr w:type="spellEnd"/>
+      <w:r>
+        <w:rPr>
+          <w:rFonts w:ascii="Times New Roman" w:hAnsi="Times New Roman" w:cs="Times New Roman"/>
+          <w:i/>
+          <w:iCs/>
+        </w:rPr>
+        <w:t xml:space="preserve"> </w:t>
+      </w:r>
+      <w:proofErr w:type="spellStart"/>
+      <w:r>
+        <w:rPr>
+          <w:rFonts w:ascii="Times New Roman" w:hAnsi="Times New Roman" w:cs="Times New Roman"/>
+          <w:i/>
+          <w:iCs/>
+        </w:rPr>
+        <w:t>Engl</w:t>
+      </w:r>
+      <w:proofErr w:type="spellEnd"/>
+      <w:r>
+        <w:rPr>
+          <w:rFonts w:ascii="Times New Roman" w:hAnsi="Times New Roman" w:cs="Times New Roman"/>
+          <w:i/>
+          <w:iCs/>
+        </w:rPr>
+        <w:t xml:space="preserve"> 2003</w:t>
+      </w:r>
+      <w:r>
+        <w:rPr>
+          <w:rFonts w:ascii="Times New Roman" w:hAnsi="Times New Roman" w:cs="Times New Roman"/>
+        </w:rPr>
+        <w:t>. 2018;47(19):6645-6653. doi:10.1039/c8dt00838h</w:t>
+      </w:r>
+    </w:p>
+    <w:p>
+      <w:pPr>
+        <w:pStyle w:val="Bibliography"/>
+        <w:rPr>
+          <w:rFonts w:ascii="Times New Roman" w:hAnsi="Times New Roman" w:cs="Times New Roman"/>
+        </w:rPr>
+      </w:pPr>
+      <w:r>
+        <w:rPr>
+          <w:rFonts w:ascii="Times New Roman" w:hAnsi="Times New Roman" w:cs="Times New Roman"/>
+        </w:rPr>
+        <w:t>3.</w:t>
+      </w:r>
+      <w:r>
+        <w:rPr>
+          <w:rFonts w:ascii="Times New Roman" w:hAnsi="Times New Roman" w:cs="Times New Roman"/>
+        </w:rPr>
+        <w:tab/>
+      </w:r>
+      <w:proofErr w:type="spellStart"/>
+      <w:r>
+        <w:rPr>
+          <w:rFonts w:ascii="Times New Roman" w:hAnsi="Times New Roman" w:cs="Times New Roman"/>
+        </w:rPr>
+        <w:t>Lahiri</w:t>
+      </w:r>
+      <w:proofErr w:type="spellEnd"/>
+      <w:r>
+        <w:rPr>
+          <w:rFonts w:ascii="Times New Roman" w:hAnsi="Times New Roman" w:cs="Times New Roman"/>
+        </w:rPr>
+        <w:t xml:space="preserve"> A, Maji A, </w:t>
+      </w:r>
+      <w:proofErr w:type="spellStart"/>
+      <w:r>
+        <w:rPr>
+          <w:rFonts w:ascii="Times New Roman" w:hAnsi="Times New Roman" w:cs="Times New Roman"/>
+        </w:rPr>
+        <w:t>Potdar</w:t>
+      </w:r>
+      <w:proofErr w:type="spellEnd"/>
+      <w:r>
+        <w:rPr>
+          <w:rFonts w:ascii="Times New Roman" w:hAnsi="Times New Roman" w:cs="Times New Roman"/>
+        </w:rPr>
+        <w:t xml:space="preserve"> PD, et al. Lung cancer immunotherapy: progress, pitfalls, and promises. </w:t>
+      </w:r>
+      <w:r>
+        <w:rPr>
+          <w:rFonts w:ascii="Times New Roman" w:hAnsi="Times New Roman" w:cs="Times New Roman"/>
+          <w:i/>
+          <w:iCs/>
+        </w:rPr>
+        <w:t>Mol Cancer</w:t>
+      </w:r>
+      <w:r>
+        <w:rPr>
+          <w:rFonts w:ascii="Times New Roman" w:hAnsi="Times New Roman" w:cs="Times New Roman"/>
+        </w:rPr>
+        <w:t xml:space="preserve">. </w:t>
+      </w:r>
+      <w:proofErr w:type="gramStart"/>
+      <w:r>
+        <w:rPr>
+          <w:rFonts w:ascii="Times New Roman" w:hAnsi="Times New Roman" w:cs="Times New Roman"/>
+        </w:rPr>
+        <w:t>2023;22:40</w:t>
+      </w:r>
+      <w:proofErr w:type="gramEnd"/>
+      <w:r>
+        <w:rPr>
+          <w:rFonts w:ascii="Times New Roman" w:hAnsi="Times New Roman" w:cs="Times New Roman"/>
+        </w:rPr>
+        <w:t>. doi:10.1186/s12943-023-01740-y</w:t>
+      </w:r>
+    </w:p>
+    <w:p>
+      <w:pPr>
+        <w:pStyle w:val="Bibliography"/>
+        <w:rPr>
+          <w:rFonts w:ascii="Times New Roman" w:hAnsi="Times New Roman" w:cs="Times New Roman"/>
+        </w:rPr>
+      </w:pPr>
+      <w:r>
+        <w:rPr>
+          <w:rFonts w:ascii="Times New Roman" w:hAnsi="Times New Roman" w:cs="Times New Roman"/>
+        </w:rPr>
+        <w:t>4.</w:t>
+      </w:r>
+      <w:r>
+        <w:rPr>
+          <w:rFonts w:ascii="Times New Roman" w:hAnsi="Times New Roman" w:cs="Times New Roman"/>
+        </w:rPr>
+        <w:tab/>
+      </w:r>
+      <w:proofErr w:type="spellStart"/>
+      <w:r>
+        <w:rPr>
+          <w:rFonts w:ascii="Times New Roman" w:hAnsi="Times New Roman" w:cs="Times New Roman"/>
+        </w:rPr>
+        <w:t>Garon</w:t>
+      </w:r>
+      <w:proofErr w:type="spellEnd"/>
+      <w:r>
+        <w:rPr>
+          <w:rFonts w:ascii="Times New Roman" w:hAnsi="Times New Roman" w:cs="Times New Roman"/>
+        </w:rPr>
+        <w:t xml:space="preserve"> EB, Rizvi NA, Hui R, et al. Pembrolizumab for the treatment of non-small-cell lung cancer. </w:t>
+      </w:r>
+      <w:r>
+        <w:rPr>
+          <w:rFonts w:ascii="Times New Roman" w:hAnsi="Times New Roman" w:cs="Times New Roman"/>
+          <w:i/>
+          <w:iCs/>
+        </w:rPr>
+        <w:t xml:space="preserve">N </w:t>
+      </w:r>
+      <w:proofErr w:type="spellStart"/>
+      <w:r>
+        <w:rPr>
+          <w:rFonts w:ascii="Times New Roman" w:hAnsi="Times New Roman" w:cs="Times New Roman"/>
+          <w:i/>
+          <w:iCs/>
+        </w:rPr>
+        <w:t>Engl</w:t>
+      </w:r>
+      <w:proofErr w:type="spellEnd"/>
+      <w:r>
+        <w:rPr>
+          <w:rFonts w:ascii="Times New Roman" w:hAnsi="Times New Roman" w:cs="Times New Roman"/>
+          <w:i/>
+          <w:iCs/>
+        </w:rPr>
+        <w:t xml:space="preserve"> J Med</w:t>
+      </w:r>
+      <w:r>
+        <w:rPr>
+          <w:rFonts w:ascii="Times New Roman" w:hAnsi="Times New Roman" w:cs="Times New Roman"/>
+        </w:rPr>
+        <w:t>. 2015;372(21):2018-2028. doi:10.1056/NEJMoa1501824</w:t>
+      </w:r>
+    </w:p>
+    <w:p>
+      <w:pPr>
+        <w:pStyle w:val="Bibliography"/>
+        <w:rPr>
+          <w:rFonts w:ascii="Times New Roman" w:hAnsi="Times New Roman" w:cs="Times New Roman"/>
+        </w:rPr>
+      </w:pPr>
+      <w:r>
+        <w:rPr>
+          <w:rFonts w:ascii="Times New Roman" w:hAnsi="Times New Roman" w:cs="Times New Roman"/>
+        </w:rPr>
+        <w:t>5.</w:t>
+      </w:r>
+      <w:r>
+        <w:rPr>
+          <w:rFonts w:ascii="Times New Roman" w:hAnsi="Times New Roman" w:cs="Times New Roman"/>
+        </w:rPr>
+        <w:tab/>
+      </w:r>
+      <w:proofErr w:type="spellStart"/>
+      <w:r>
+        <w:rPr>
+          <w:rFonts w:ascii="Times New Roman" w:hAnsi="Times New Roman" w:cs="Times New Roman"/>
+        </w:rPr>
+        <w:t>Brahmer</w:t>
+      </w:r>
+      <w:proofErr w:type="spellEnd"/>
+      <w:r>
+        <w:rPr>
+          <w:rFonts w:ascii="Times New Roman" w:hAnsi="Times New Roman" w:cs="Times New Roman"/>
+        </w:rPr>
+        <w:t xml:space="preserve"> JR, Drake CG, </w:t>
+      </w:r>
+      <w:proofErr w:type="spellStart"/>
+      <w:r>
+        <w:rPr>
+          <w:rFonts w:ascii="Times New Roman" w:hAnsi="Times New Roman" w:cs="Times New Roman"/>
+        </w:rPr>
+        <w:t>Wollner</w:t>
+      </w:r>
+      <w:proofErr w:type="spellEnd"/>
+      <w:r>
+        <w:rPr>
+          <w:rFonts w:ascii="Times New Roman" w:hAnsi="Times New Roman" w:cs="Times New Roman"/>
+        </w:rPr>
+        <w:t xml:space="preserve"> I, et al. Phase I study of single-agent anti-programmed death-1 (MDX-1106) in refractory solid tumors: safety, clinical activity, pharmacodynamics, and immunologic correlates. </w:t>
+      </w:r>
+      <w:r>
+        <w:rPr>
+          <w:rFonts w:ascii="Times New Roman" w:hAnsi="Times New Roman" w:cs="Times New Roman"/>
+          <w:i/>
+          <w:iCs/>
+        </w:rPr>
         <w:t>J Clin Oncol Off J Am Soc Clin Oncol</w:t>
       </w:r>
       <w:r>
@@ -11736,83 +12041,31 @@
           <w:i/>
           <w:iCs/>
         </w:rPr>
-        <w:t>N Engl J Med</w:t>
-      </w:r>
-      <w:r>
-        <w:rPr>
-          <w:rFonts w:ascii="Times New Roman" w:hAnsi="Times New Roman" w:cs="Times New Roman"/>
-        </w:rPr>
-        <w:t>. 2016;375(19):1823-1833. doi:10.1056/NEJMoa1606774</w:t>
-      </w:r>
-    </w:p>
-    <w:p>
-      <w:pPr>
-        <w:pStyle w:val="Bibliography"/>
-        <w:rPr>
-          <w:rFonts w:ascii="Times New Roman" w:hAnsi="Times New Roman" w:cs="Times New Roman"/>
-        </w:rPr>
-      </w:pPr>
-      <w:r>
-        <w:rPr>
-          <w:rFonts w:ascii="Times New Roman" w:hAnsi="Times New Roman" w:cs="Times New Roman"/>
-        </w:rPr>
-        <w:t>7.</w:t>
-      </w:r>
-      <w:r>
-        <w:rPr>
-          <w:rFonts w:ascii="Times New Roman" w:hAnsi="Times New Roman" w:cs="Times New Roman"/>
-        </w:rPr>
-        <w:tab/>
-        <w:t xml:space="preserve">Mok TSK, Wu YL, Kudaba I, et al. Pembrolizumab versus chemotherapy for previously untreated, PD-L1-expressing, locally advanced or metastatic non-small-cell lung cancer (KEYNOTE-042): a randomised, open-label, controlled, phase 3 trial. </w:t>
-      </w:r>
+        <w:t xml:space="preserve">N </w:t>
+      </w:r>
+      <w:proofErr w:type="spellStart"/>
       <w:r>
         <w:rPr>
           <w:rFonts w:ascii="Times New Roman" w:hAnsi="Times New Roman" w:cs="Times New Roman"/>
           <w:i/>
           <w:iCs/>
         </w:rPr>
-        <w:t>Lancet Lond Engl</w:t>
-      </w:r>
-      <w:r>
-        <w:rPr>
-          <w:rFonts w:ascii="Times New Roman" w:hAnsi="Times New Roman" w:cs="Times New Roman"/>
-        </w:rPr>
-        <w:t>. 2019;393(10183):1819-1830. doi:10.1016/S0140-6736(18)32409-7</w:t>
-      </w:r>
-    </w:p>
-    <w:p>
-      <w:pPr>
-        <w:pStyle w:val="Bibliography"/>
-        <w:rPr>
-          <w:rFonts w:ascii="Times New Roman" w:hAnsi="Times New Roman" w:cs="Times New Roman"/>
-        </w:rPr>
-      </w:pPr>
-      <w:r>
-        <w:rPr>
-          <w:rFonts w:ascii="Times New Roman" w:hAnsi="Times New Roman" w:cs="Times New Roman"/>
-        </w:rPr>
-        <w:t>8.</w:t>
-      </w:r>
-      <w:r>
-        <w:rPr>
-          <w:rFonts w:ascii="Times New Roman" w:hAnsi="Times New Roman" w:cs="Times New Roman"/>
-        </w:rPr>
-        <w:tab/>
-        <w:t xml:space="preserve">Di Federico A, De Giglio A, Parisi C, Gelsomino F, Ardizzoni A. PD-1/PD-L1 inhibitor monotherapy or in combination with chemotherapy as upfront treatment for advanced NSCLC with PD-L1 expression ≥ 50%: Selecting the best strategy. </w:t>
-      </w:r>
+        <w:t>Engl</w:t>
+      </w:r>
+      <w:proofErr w:type="spellEnd"/>
       <w:r>
         <w:rPr>
           <w:rFonts w:ascii="Times New Roman" w:hAnsi="Times New Roman" w:cs="Times New Roman"/>
           <w:i/>
           <w:iCs/>
         </w:rPr>
-        <w:t>Crit Rev Oncol Hematol</w:t>
-      </w:r>
-      <w:r>
-        <w:rPr>
-          <w:rFonts w:ascii="Times New Roman" w:hAnsi="Times New Roman" w:cs="Times New Roman"/>
-        </w:rPr>
-        <w:t>. 2021;160:103302. doi:10.1016/j.critrevonc.2021.103302</w:t>
+        <w:t xml:space="preserve"> J Med</w:t>
+      </w:r>
+      <w:r>
+        <w:rPr>
+          <w:rFonts w:ascii="Times New Roman" w:hAnsi="Times New Roman" w:cs="Times New Roman"/>
+        </w:rPr>
+        <w:t>. 2016;375(19):1823-1833. doi:10.1056/NEJMoa1606774</w:t>
       </w:r>
     </w:p>
     <w:p>
@@ -11820,6 +12073,215 @@
         <w:pStyle w:val="Bibliography"/>
         <w:rPr>
           <w:rFonts w:ascii="Times New Roman" w:hAnsi="Times New Roman" w:cs="Times New Roman"/>
+        </w:rPr>
+      </w:pPr>
+      <w:r>
+        <w:rPr>
+          <w:rFonts w:ascii="Times New Roman" w:hAnsi="Times New Roman" w:cs="Times New Roman"/>
+        </w:rPr>
+        <w:t>7.</w:t>
+      </w:r>
+      <w:r>
+        <w:rPr>
+          <w:rFonts w:ascii="Times New Roman" w:hAnsi="Times New Roman" w:cs="Times New Roman"/>
+        </w:rPr>
+        <w:tab/>
+      </w:r>
+      <w:proofErr w:type="spellStart"/>
+      <w:r>
+        <w:rPr>
+          <w:rFonts w:ascii="Times New Roman" w:hAnsi="Times New Roman" w:cs="Times New Roman"/>
+        </w:rPr>
+        <w:t>Mok</w:t>
+      </w:r>
+      <w:proofErr w:type="spellEnd"/>
+      <w:r>
+        <w:rPr>
+          <w:rFonts w:ascii="Times New Roman" w:hAnsi="Times New Roman" w:cs="Times New Roman"/>
+        </w:rPr>
+        <w:t xml:space="preserve"> TSK, Wu YL, </w:t>
+      </w:r>
+      <w:proofErr w:type="spellStart"/>
+      <w:r>
+        <w:rPr>
+          <w:rFonts w:ascii="Times New Roman" w:hAnsi="Times New Roman" w:cs="Times New Roman"/>
+        </w:rPr>
+        <w:t>Kudaba</w:t>
+      </w:r>
+      <w:proofErr w:type="spellEnd"/>
+      <w:r>
+        <w:rPr>
+          <w:rFonts w:ascii="Times New Roman" w:hAnsi="Times New Roman" w:cs="Times New Roman"/>
+        </w:rPr>
+        <w:t xml:space="preserve"> I, et al. Pembrolizumab versus chemotherapy for previously untreated, PD-L1-expressing, locally advanced or metastatic non-small-cell lung cancer (KEYNOTE-042): a </w:t>
+      </w:r>
+      <w:proofErr w:type="spellStart"/>
+      <w:r>
+        <w:rPr>
+          <w:rFonts w:ascii="Times New Roman" w:hAnsi="Times New Roman" w:cs="Times New Roman"/>
+        </w:rPr>
+        <w:t>randomised</w:t>
+      </w:r>
+      <w:proofErr w:type="spellEnd"/>
+      <w:r>
+        <w:rPr>
+          <w:rFonts w:ascii="Times New Roman" w:hAnsi="Times New Roman" w:cs="Times New Roman"/>
+        </w:rPr>
+        <w:t xml:space="preserve">, open-label, controlled, phase 3 trial. </w:t>
+      </w:r>
+      <w:r>
+        <w:rPr>
+          <w:rFonts w:ascii="Times New Roman" w:hAnsi="Times New Roman" w:cs="Times New Roman"/>
+          <w:i/>
+          <w:iCs/>
+        </w:rPr>
+        <w:t xml:space="preserve">Lancet </w:t>
+      </w:r>
+      <w:proofErr w:type="spellStart"/>
+      <w:r>
+        <w:rPr>
+          <w:rFonts w:ascii="Times New Roman" w:hAnsi="Times New Roman" w:cs="Times New Roman"/>
+          <w:i/>
+          <w:iCs/>
+        </w:rPr>
+        <w:t>Lond</w:t>
+      </w:r>
+      <w:proofErr w:type="spellEnd"/>
+      <w:r>
+        <w:rPr>
+          <w:rFonts w:ascii="Times New Roman" w:hAnsi="Times New Roman" w:cs="Times New Roman"/>
+          <w:i/>
+          <w:iCs/>
+        </w:rPr>
+        <w:t xml:space="preserve"> Engl</w:t>
+      </w:r>
+      <w:r>
+        <w:rPr>
+          <w:rFonts w:ascii="Times New Roman" w:hAnsi="Times New Roman" w:cs="Times New Roman"/>
+        </w:rPr>
+        <w:t>. 2019;393(10183):1819-1830. doi:10.1016/S0140-6736(18)32409-7</w:t>
+      </w:r>
+    </w:p>
+    <w:p>
+      <w:pPr>
+        <w:pStyle w:val="Bibliography"/>
+        <w:rPr>
+          <w:rFonts w:ascii="Times New Roman" w:hAnsi="Times New Roman" w:cs="Times New Roman"/>
+        </w:rPr>
+      </w:pPr>
+      <w:r>
+        <w:rPr>
+          <w:rFonts w:ascii="Times New Roman" w:hAnsi="Times New Roman" w:cs="Times New Roman"/>
+        </w:rPr>
+        <w:t>8.</w:t>
+      </w:r>
+      <w:r>
+        <w:rPr>
+          <w:rFonts w:ascii="Times New Roman" w:hAnsi="Times New Roman" w:cs="Times New Roman"/>
+        </w:rPr>
+        <w:tab/>
+        <w:t xml:space="preserve">Di Federico A, De Giglio A, </w:t>
+      </w:r>
+      <w:proofErr w:type="spellStart"/>
+      <w:r>
+        <w:rPr>
+          <w:rFonts w:ascii="Times New Roman" w:hAnsi="Times New Roman" w:cs="Times New Roman"/>
+        </w:rPr>
+        <w:t>Parisi</w:t>
+      </w:r>
+      <w:proofErr w:type="spellEnd"/>
+      <w:r>
+        <w:rPr>
+          <w:rFonts w:ascii="Times New Roman" w:hAnsi="Times New Roman" w:cs="Times New Roman"/>
+        </w:rPr>
+        <w:t xml:space="preserve"> C, </w:t>
+      </w:r>
+      <w:proofErr w:type="spellStart"/>
+      <w:r>
+        <w:rPr>
+          <w:rFonts w:ascii="Times New Roman" w:hAnsi="Times New Roman" w:cs="Times New Roman"/>
+        </w:rPr>
+        <w:t>Gelsomino</w:t>
+      </w:r>
+      <w:proofErr w:type="spellEnd"/>
+      <w:r>
+        <w:rPr>
+          <w:rFonts w:ascii="Times New Roman" w:hAnsi="Times New Roman" w:cs="Times New Roman"/>
+        </w:rPr>
+        <w:t xml:space="preserve"> F, </w:t>
+      </w:r>
+      <w:proofErr w:type="spellStart"/>
+      <w:r>
+        <w:rPr>
+          <w:rFonts w:ascii="Times New Roman" w:hAnsi="Times New Roman" w:cs="Times New Roman"/>
+        </w:rPr>
+        <w:t>Ardizzoni</w:t>
+      </w:r>
+      <w:proofErr w:type="spellEnd"/>
+      <w:r>
+        <w:rPr>
+          <w:rFonts w:ascii="Times New Roman" w:hAnsi="Times New Roman" w:cs="Times New Roman"/>
+        </w:rPr>
+        <w:t xml:space="preserve"> A. PD-1/PD-L1 inhibitor monotherapy or in combination with chemotherapy as upfront treatment for advanced NSCLC with PD-L1 expression ≥ 50%: Selecting the best strategy. </w:t>
+      </w:r>
+      <w:r>
+        <w:rPr>
+          <w:rFonts w:ascii="Times New Roman" w:hAnsi="Times New Roman" w:cs="Times New Roman"/>
+          <w:i/>
+          <w:iCs/>
+        </w:rPr>
+        <w:t xml:space="preserve">Crit Rev Oncol </w:t>
+      </w:r>
+      <w:proofErr w:type="spellStart"/>
+      <w:r>
+        <w:rPr>
+          <w:rFonts w:ascii="Times New Roman" w:hAnsi="Times New Roman" w:cs="Times New Roman"/>
+          <w:i/>
+          <w:iCs/>
+        </w:rPr>
+        <w:t>Hematol</w:t>
+      </w:r>
+      <w:proofErr w:type="spellEnd"/>
+      <w:r>
+        <w:rPr>
+          <w:rFonts w:ascii="Times New Roman" w:hAnsi="Times New Roman" w:cs="Times New Roman"/>
+        </w:rPr>
+        <w:t xml:space="preserve">. </w:t>
+      </w:r>
+      <w:proofErr w:type="gramStart"/>
+      <w:r>
+        <w:rPr>
+          <w:rFonts w:ascii="Times New Roman" w:hAnsi="Times New Roman" w:cs="Times New Roman"/>
+        </w:rPr>
+        <w:t>2021;160:103302</w:t>
+      </w:r>
+      <w:proofErr w:type="gramEnd"/>
+      <w:r>
+        <w:rPr>
+          <w:rFonts w:ascii="Times New Roman" w:hAnsi="Times New Roman" w:cs="Times New Roman"/>
+        </w:rPr>
+        <w:t xml:space="preserve">. </w:t>
+      </w:r>
+      <w:proofErr w:type="gramStart"/>
+      <w:r>
+        <w:rPr>
+          <w:rFonts w:ascii="Times New Roman" w:hAnsi="Times New Roman" w:cs="Times New Roman"/>
+        </w:rPr>
+        <w:t>doi:10.1016/j.critrevonc</w:t>
+      </w:r>
+      <w:proofErr w:type="gramEnd"/>
+      <w:r>
+        <w:rPr>
+          <w:rFonts w:ascii="Times New Roman" w:hAnsi="Times New Roman" w:cs="Times New Roman"/>
+        </w:rPr>
+        <w:t>.2021.103302</w:t>
+      </w:r>
+    </w:p>
+    <w:p>
+      <w:pPr>
+        <w:pStyle w:val="Bibliography"/>
+        <w:rPr>
+          <w:rFonts w:ascii="Times New Roman" w:hAnsi="Times New Roman" w:cs="Times New Roman"/>
           <w:lang w:val="pt-BR"/>
         </w:rPr>
       </w:pPr>
@@ -11827,6 +12289,7 @@
         <w:rPr>
           <w:rFonts w:ascii="Times New Roman" w:hAnsi="Times New Roman" w:cs="Times New Roman"/>
         </w:rPr>
+        <w:lastRenderedPageBreak/>
         <w:t>9.</w:t>
       </w:r>
       <w:r>
@@ -11834,7 +12297,21 @@
           <w:rFonts w:ascii="Times New Roman" w:hAnsi="Times New Roman" w:cs="Times New Roman"/>
         </w:rPr>
         <w:tab/>
-        <w:t xml:space="preserve">Gandhi L, Rodríguez-Abreu D, Gadgeel S, et al. Pembrolizumab plus Chemotherapy in Metastatic Non–Small-Cell Lung Cancer. </w:t>
+        <w:t xml:space="preserve">Gandhi L, Rodríguez-Abreu D, </w:t>
+      </w:r>
+      <w:proofErr w:type="spellStart"/>
+      <w:r>
+        <w:rPr>
+          <w:rFonts w:ascii="Times New Roman" w:hAnsi="Times New Roman" w:cs="Times New Roman"/>
+        </w:rPr>
+        <w:t>Gadgeel</w:t>
+      </w:r>
+      <w:proofErr w:type="spellEnd"/>
+      <w:r>
+        <w:rPr>
+          <w:rFonts w:ascii="Times New Roman" w:hAnsi="Times New Roman" w:cs="Times New Roman"/>
+        </w:rPr>
+        <w:t xml:space="preserve"> S, et al. Pembrolizumab plus Chemotherapy in Metastatic Non–Small-Cell Lung Cancer. </w:t>
       </w:r>
       <w:r>
         <w:rPr>
@@ -11843,13 +12320,33 @@
           <w:iCs/>
           <w:lang w:val="pt-BR"/>
         </w:rPr>
-        <w:t>N Engl J Med</w:t>
-      </w:r>
-      <w:r>
-        <w:rPr>
-          <w:rFonts w:ascii="Times New Roman" w:hAnsi="Times New Roman" w:cs="Times New Roman"/>
+        <w:t xml:space="preserve">N </w:t>
+      </w:r>
+      <w:proofErr w:type="spellStart"/>
+      <w:r>
+        <w:rPr>
+          <w:rFonts w:ascii="Times New Roman" w:hAnsi="Times New Roman" w:cs="Times New Roman"/>
+          <w:i/>
+          <w:iCs/>
           <w:lang w:val="pt-BR"/>
         </w:rPr>
+        <w:t>Engl</w:t>
+      </w:r>
+      <w:proofErr w:type="spellEnd"/>
+      <w:r>
+        <w:rPr>
+          <w:rFonts w:ascii="Times New Roman" w:hAnsi="Times New Roman" w:cs="Times New Roman"/>
+          <w:i/>
+          <w:iCs/>
+          <w:lang w:val="pt-BR"/>
+        </w:rPr>
+        <w:t xml:space="preserve"> J Med</w:t>
+      </w:r>
+      <w:r>
+        <w:rPr>
+          <w:rFonts w:ascii="Times New Roman" w:hAnsi="Times New Roman" w:cs="Times New Roman"/>
+          <w:lang w:val="pt-BR"/>
+        </w:rPr>
         <w:t>. 2018;378(22):2078-2092. doi:10.1056/NEJMoa1801005</w:t>
       </w:r>
     </w:p>
@@ -11865,7 +12362,6 @@
           <w:rFonts w:ascii="Times New Roman" w:hAnsi="Times New Roman" w:cs="Times New Roman"/>
           <w:lang w:val="pt-BR"/>
         </w:rPr>
-        <w:lastRenderedPageBreak/>
         <w:t>10.</w:t>
       </w:r>
       <w:r>
@@ -11888,7 +12384,25 @@
           <w:i/>
           <w:iCs/>
         </w:rPr>
-        <w:t>N Engl J Med</w:t>
+        <w:t xml:space="preserve">N </w:t>
+      </w:r>
+      <w:proofErr w:type="spellStart"/>
+      <w:r>
+        <w:rPr>
+          <w:rFonts w:ascii="Times New Roman" w:hAnsi="Times New Roman" w:cs="Times New Roman"/>
+          <w:i/>
+          <w:iCs/>
+        </w:rPr>
+        <w:t>Engl</w:t>
+      </w:r>
+      <w:proofErr w:type="spellEnd"/>
+      <w:r>
+        <w:rPr>
+          <w:rFonts w:ascii="Times New Roman" w:hAnsi="Times New Roman" w:cs="Times New Roman"/>
+          <w:i/>
+          <w:iCs/>
+        </w:rPr>
+        <w:t xml:space="preserve"> J Med</w:t>
       </w:r>
       <w:r>
         <w:rPr>
@@ -11923,83 +12437,31 @@
           <w:i/>
           <w:iCs/>
         </w:rPr>
-        <w:t>N Engl J Med</w:t>
-      </w:r>
-      <w:r>
-        <w:rPr>
-          <w:rFonts w:ascii="Times New Roman" w:hAnsi="Times New Roman" w:cs="Times New Roman"/>
-        </w:rPr>
-        <w:t>. 2019;381(21):2020-2031. doi:10.1056/NEJMoa1910231</w:t>
-      </w:r>
-    </w:p>
-    <w:p>
-      <w:pPr>
-        <w:pStyle w:val="Bibliography"/>
-        <w:rPr>
-          <w:rFonts w:ascii="Times New Roman" w:hAnsi="Times New Roman" w:cs="Times New Roman"/>
-        </w:rPr>
-      </w:pPr>
-      <w:r>
-        <w:rPr>
-          <w:rFonts w:ascii="Times New Roman" w:hAnsi="Times New Roman" w:cs="Times New Roman"/>
-        </w:rPr>
-        <w:t>12.</w:t>
-      </w:r>
-      <w:r>
-        <w:rPr>
-          <w:rFonts w:ascii="Times New Roman" w:hAnsi="Times New Roman" w:cs="Times New Roman"/>
-        </w:rPr>
-        <w:tab/>
-        <w:t xml:space="preserve">Brahmer J, Reckamp KL, Baas P, et al. Nivolumab versus Docetaxel in Advanced Squamous-Cell Non-Small-Cell Lung Cancer. </w:t>
-      </w:r>
+        <w:t xml:space="preserve">N </w:t>
+      </w:r>
+      <w:proofErr w:type="spellStart"/>
       <w:r>
         <w:rPr>
           <w:rFonts w:ascii="Times New Roman" w:hAnsi="Times New Roman" w:cs="Times New Roman"/>
           <w:i/>
           <w:iCs/>
         </w:rPr>
-        <w:t>N Engl J Med</w:t>
-      </w:r>
-      <w:r>
-        <w:rPr>
-          <w:rFonts w:ascii="Times New Roman" w:hAnsi="Times New Roman" w:cs="Times New Roman"/>
-        </w:rPr>
-        <w:t>. 2015;373(2):123-135. doi:10.1056/NEJMoa1504627</w:t>
-      </w:r>
-    </w:p>
-    <w:p>
-      <w:pPr>
-        <w:pStyle w:val="Bibliography"/>
-        <w:rPr>
-          <w:rFonts w:ascii="Times New Roman" w:hAnsi="Times New Roman" w:cs="Times New Roman"/>
-        </w:rPr>
-      </w:pPr>
-      <w:r>
-        <w:rPr>
-          <w:rFonts w:ascii="Times New Roman" w:hAnsi="Times New Roman" w:cs="Times New Roman"/>
-        </w:rPr>
-        <w:t>13.</w:t>
-      </w:r>
-      <w:r>
-        <w:rPr>
-          <w:rFonts w:ascii="Times New Roman" w:hAnsi="Times New Roman" w:cs="Times New Roman"/>
-        </w:rPr>
-        <w:tab/>
-        <w:t xml:space="preserve">Seymour L, Bogaerts J, Perrone A, et al. iRECIST: guidelines for response criteria for use in trials testing immunotherapeutics. </w:t>
-      </w:r>
+        <w:t>Engl</w:t>
+      </w:r>
+      <w:proofErr w:type="spellEnd"/>
       <w:r>
         <w:rPr>
           <w:rFonts w:ascii="Times New Roman" w:hAnsi="Times New Roman" w:cs="Times New Roman"/>
           <w:i/>
           <w:iCs/>
         </w:rPr>
-        <w:t>Lancet Oncol</w:t>
-      </w:r>
-      <w:r>
-        <w:rPr>
-          <w:rFonts w:ascii="Times New Roman" w:hAnsi="Times New Roman" w:cs="Times New Roman"/>
-        </w:rPr>
-        <w:t>. 2017;18(3):e143-e152. doi:10.1016/S1470-2045(17)30074-8</w:t>
+        <w:t xml:space="preserve"> J Med</w:t>
+      </w:r>
+      <w:r>
+        <w:rPr>
+          <w:rFonts w:ascii="Times New Roman" w:hAnsi="Times New Roman" w:cs="Times New Roman"/>
+        </w:rPr>
+        <w:t>. 2019;381(21):2020-2031. doi:10.1056/NEJMoa1910231</w:t>
       </w:r>
     </w:p>
     <w:p>
@@ -12013,14 +12475,41 @@
         <w:rPr>
           <w:rFonts w:ascii="Times New Roman" w:hAnsi="Times New Roman" w:cs="Times New Roman"/>
         </w:rPr>
-        <w:t>14.</w:t>
+        <w:t>12.</w:t>
       </w:r>
       <w:r>
         <w:rPr>
           <w:rFonts w:ascii="Times New Roman" w:hAnsi="Times New Roman" w:cs="Times New Roman"/>
         </w:rPr>
         <w:tab/>
-        <w:t xml:space="preserve">Gould MK, Huang BZ, Tammemagi MC, Kinar Y, Shiff R. Machine Learning for Early Lung Cancer Identification Using Routine Clinical and Laboratory Data. </w:t>
+      </w:r>
+      <w:proofErr w:type="spellStart"/>
+      <w:r>
+        <w:rPr>
+          <w:rFonts w:ascii="Times New Roman" w:hAnsi="Times New Roman" w:cs="Times New Roman"/>
+        </w:rPr>
+        <w:t>Brahmer</w:t>
+      </w:r>
+      <w:proofErr w:type="spellEnd"/>
+      <w:r>
+        <w:rPr>
+          <w:rFonts w:ascii="Times New Roman" w:hAnsi="Times New Roman" w:cs="Times New Roman"/>
+        </w:rPr>
+        <w:t xml:space="preserve"> J, </w:t>
+      </w:r>
+      <w:proofErr w:type="spellStart"/>
+      <w:r>
+        <w:rPr>
+          <w:rFonts w:ascii="Times New Roman" w:hAnsi="Times New Roman" w:cs="Times New Roman"/>
+        </w:rPr>
+        <w:t>Reckamp</w:t>
+      </w:r>
+      <w:proofErr w:type="spellEnd"/>
+      <w:r>
+        <w:rPr>
+          <w:rFonts w:ascii="Times New Roman" w:hAnsi="Times New Roman" w:cs="Times New Roman"/>
+        </w:rPr>
+        <w:t xml:space="preserve"> KL, Baas P, et al. Nivolumab versus Docetaxel in Advanced Squamous-Cell Non-Small-Cell Lung Cancer. </w:t>
       </w:r>
       <w:r>
         <w:rPr>
@@ -12028,6 +12517,178 @@
           <w:i/>
           <w:iCs/>
         </w:rPr>
+        <w:t xml:space="preserve">N </w:t>
+      </w:r>
+      <w:proofErr w:type="spellStart"/>
+      <w:r>
+        <w:rPr>
+          <w:rFonts w:ascii="Times New Roman" w:hAnsi="Times New Roman" w:cs="Times New Roman"/>
+          <w:i/>
+          <w:iCs/>
+        </w:rPr>
+        <w:t>Engl</w:t>
+      </w:r>
+      <w:proofErr w:type="spellEnd"/>
+      <w:r>
+        <w:rPr>
+          <w:rFonts w:ascii="Times New Roman" w:hAnsi="Times New Roman" w:cs="Times New Roman"/>
+          <w:i/>
+          <w:iCs/>
+        </w:rPr>
+        <w:t xml:space="preserve"> J Med</w:t>
+      </w:r>
+      <w:r>
+        <w:rPr>
+          <w:rFonts w:ascii="Times New Roman" w:hAnsi="Times New Roman" w:cs="Times New Roman"/>
+        </w:rPr>
+        <w:t>. 2015;373(2):123-135. doi:10.1056/NEJMoa1504627</w:t>
+      </w:r>
+    </w:p>
+    <w:p>
+      <w:pPr>
+        <w:pStyle w:val="Bibliography"/>
+        <w:rPr>
+          <w:rFonts w:ascii="Times New Roman" w:hAnsi="Times New Roman" w:cs="Times New Roman"/>
+        </w:rPr>
+      </w:pPr>
+      <w:r>
+        <w:rPr>
+          <w:rFonts w:ascii="Times New Roman" w:hAnsi="Times New Roman" w:cs="Times New Roman"/>
+        </w:rPr>
+        <w:t>13.</w:t>
+      </w:r>
+      <w:r>
+        <w:rPr>
+          <w:rFonts w:ascii="Times New Roman" w:hAnsi="Times New Roman" w:cs="Times New Roman"/>
+        </w:rPr>
+        <w:tab/>
+        <w:t xml:space="preserve">Seymour L, Bogaerts J, Perrone A, et al. </w:t>
+      </w:r>
+      <w:proofErr w:type="spellStart"/>
+      <w:r>
+        <w:rPr>
+          <w:rFonts w:ascii="Times New Roman" w:hAnsi="Times New Roman" w:cs="Times New Roman"/>
+        </w:rPr>
+        <w:t>iRECIST</w:t>
+      </w:r>
+      <w:proofErr w:type="spellEnd"/>
+      <w:r>
+        <w:rPr>
+          <w:rFonts w:ascii="Times New Roman" w:hAnsi="Times New Roman" w:cs="Times New Roman"/>
+        </w:rPr>
+        <w:t xml:space="preserve">: guidelines for response criteria for use in trials testing </w:t>
+      </w:r>
+      <w:proofErr w:type="spellStart"/>
+      <w:r>
+        <w:rPr>
+          <w:rFonts w:ascii="Times New Roman" w:hAnsi="Times New Roman" w:cs="Times New Roman"/>
+        </w:rPr>
+        <w:t>immunotherapeutics</w:t>
+      </w:r>
+      <w:proofErr w:type="spellEnd"/>
+      <w:r>
+        <w:rPr>
+          <w:rFonts w:ascii="Times New Roman" w:hAnsi="Times New Roman" w:cs="Times New Roman"/>
+        </w:rPr>
+        <w:t xml:space="preserve">. </w:t>
+      </w:r>
+      <w:r>
+        <w:rPr>
+          <w:rFonts w:ascii="Times New Roman" w:hAnsi="Times New Roman" w:cs="Times New Roman"/>
+          <w:i/>
+          <w:iCs/>
+        </w:rPr>
+        <w:t>Lancet Oncol</w:t>
+      </w:r>
+      <w:r>
+        <w:rPr>
+          <w:rFonts w:ascii="Times New Roman" w:hAnsi="Times New Roman" w:cs="Times New Roman"/>
+        </w:rPr>
+        <w:t>. 2017;18(3</w:t>
+      </w:r>
+      <w:proofErr w:type="gramStart"/>
+      <w:r>
+        <w:rPr>
+          <w:rFonts w:ascii="Times New Roman" w:hAnsi="Times New Roman" w:cs="Times New Roman"/>
+        </w:rPr>
+        <w:t>):e</w:t>
+      </w:r>
+      <w:proofErr w:type="gramEnd"/>
+      <w:r>
+        <w:rPr>
+          <w:rFonts w:ascii="Times New Roman" w:hAnsi="Times New Roman" w:cs="Times New Roman"/>
+        </w:rPr>
+        <w:t>143-e152. doi:10.1016/S1470-2045(17)30074-8</w:t>
+      </w:r>
+    </w:p>
+    <w:p>
+      <w:pPr>
+        <w:pStyle w:val="Bibliography"/>
+        <w:rPr>
+          <w:rFonts w:ascii="Times New Roman" w:hAnsi="Times New Roman" w:cs="Times New Roman"/>
+        </w:rPr>
+      </w:pPr>
+      <w:r>
+        <w:rPr>
+          <w:rFonts w:ascii="Times New Roman" w:hAnsi="Times New Roman" w:cs="Times New Roman"/>
+        </w:rPr>
+        <w:t>14.</w:t>
+      </w:r>
+      <w:r>
+        <w:rPr>
+          <w:rFonts w:ascii="Times New Roman" w:hAnsi="Times New Roman" w:cs="Times New Roman"/>
+        </w:rPr>
+        <w:tab/>
+        <w:t xml:space="preserve">Gould MK, Huang BZ, </w:t>
+      </w:r>
+      <w:proofErr w:type="spellStart"/>
+      <w:r>
+        <w:rPr>
+          <w:rFonts w:ascii="Times New Roman" w:hAnsi="Times New Roman" w:cs="Times New Roman"/>
+        </w:rPr>
+        <w:t>Tammemagi</w:t>
+      </w:r>
+      <w:proofErr w:type="spellEnd"/>
+      <w:r>
+        <w:rPr>
+          <w:rFonts w:ascii="Times New Roman" w:hAnsi="Times New Roman" w:cs="Times New Roman"/>
+        </w:rPr>
+        <w:t xml:space="preserve"> MC, </w:t>
+      </w:r>
+      <w:proofErr w:type="spellStart"/>
+      <w:r>
+        <w:rPr>
+          <w:rFonts w:ascii="Times New Roman" w:hAnsi="Times New Roman" w:cs="Times New Roman"/>
+        </w:rPr>
+        <w:t>Kinar</w:t>
+      </w:r>
+      <w:proofErr w:type="spellEnd"/>
+      <w:r>
+        <w:rPr>
+          <w:rFonts w:ascii="Times New Roman" w:hAnsi="Times New Roman" w:cs="Times New Roman"/>
+        </w:rPr>
+        <w:t xml:space="preserve"> Y, </w:t>
+      </w:r>
+      <w:proofErr w:type="spellStart"/>
+      <w:r>
+        <w:rPr>
+          <w:rFonts w:ascii="Times New Roman" w:hAnsi="Times New Roman" w:cs="Times New Roman"/>
+        </w:rPr>
+        <w:t>Shiff</w:t>
+      </w:r>
+      <w:proofErr w:type="spellEnd"/>
+      <w:r>
+        <w:rPr>
+          <w:rFonts w:ascii="Times New Roman" w:hAnsi="Times New Roman" w:cs="Times New Roman"/>
+        </w:rPr>
+        <w:t xml:space="preserve"> R. Machine Learning for Early Lung Cancer Identification Using Routine Clinical and Laboratory Data. </w:t>
+      </w:r>
+      <w:r>
+        <w:rPr>
+          <w:rFonts w:ascii="Times New Roman" w:hAnsi="Times New Roman" w:cs="Times New Roman"/>
+          <w:i/>
+          <w:iCs/>
+        </w:rPr>
         <w:t>Am J Respir Crit Care Med</w:t>
       </w:r>
       <w:r>
@@ -12063,83 +12724,45 @@
           <w:i/>
           <w:iCs/>
         </w:rPr>
-        <w:t>Cancer Manag Res</w:t>
-      </w:r>
-      <w:r>
-        <w:rPr>
-          <w:rFonts w:ascii="Times New Roman" w:hAnsi="Times New Roman" w:cs="Times New Roman"/>
-        </w:rPr>
-        <w:t>. 2022;14:135-155. doi:10.2147/CMAR.S342352</w:t>
-      </w:r>
-    </w:p>
-    <w:p>
-      <w:pPr>
-        <w:pStyle w:val="Bibliography"/>
-        <w:rPr>
-          <w:rFonts w:ascii="Times New Roman" w:hAnsi="Times New Roman" w:cs="Times New Roman"/>
-        </w:rPr>
-      </w:pPr>
-      <w:r>
-        <w:rPr>
-          <w:rFonts w:ascii="Times New Roman" w:hAnsi="Times New Roman" w:cs="Times New Roman"/>
-        </w:rPr>
-        <w:t>16.</w:t>
-      </w:r>
-      <w:r>
-        <w:rPr>
-          <w:rFonts w:ascii="Times New Roman" w:hAnsi="Times New Roman" w:cs="Times New Roman"/>
-        </w:rPr>
-        <w:tab/>
-        <w:t xml:space="preserve">Nartowt BJ, Hart GR, Muhammad W, Liang Y, Stark GF, Deng J. Robust Machine Learning for Colorectal Cancer Risk Prediction and Stratification. </w:t>
-      </w:r>
+        <w:t xml:space="preserve">Cancer </w:t>
+      </w:r>
+      <w:proofErr w:type="spellStart"/>
       <w:r>
         <w:rPr>
           <w:rFonts w:ascii="Times New Roman" w:hAnsi="Times New Roman" w:cs="Times New Roman"/>
           <w:i/>
           <w:iCs/>
         </w:rPr>
-        <w:t>Front Big Data</w:t>
-      </w:r>
-      <w:r>
-        <w:rPr>
-          <w:rFonts w:ascii="Times New Roman" w:hAnsi="Times New Roman" w:cs="Times New Roman"/>
-        </w:rPr>
-        <w:t>. 2020;3:6. doi:10.3389/fdata.2020.00006</w:t>
-      </w:r>
-    </w:p>
-    <w:p>
-      <w:pPr>
-        <w:pStyle w:val="Bibliography"/>
-        <w:rPr>
-          <w:rFonts w:ascii="Times New Roman" w:hAnsi="Times New Roman" w:cs="Times New Roman"/>
-        </w:rPr>
-      </w:pPr>
-      <w:r>
-        <w:rPr>
-          <w:rFonts w:ascii="Times New Roman" w:hAnsi="Times New Roman" w:cs="Times New Roman"/>
-        </w:rPr>
-        <w:t>17.</w:t>
-      </w:r>
-      <w:r>
-        <w:rPr>
-          <w:rFonts w:ascii="Times New Roman" w:hAnsi="Times New Roman" w:cs="Times New Roman"/>
-        </w:rPr>
-        <w:tab/>
-        <w:t xml:space="preserve">Stark GF, Hart GR, Nartowt BJ, Deng J. Predicting breast cancer risk using personal health data and machine learning models. </w:t>
-      </w:r>
+        <w:t>Manag</w:t>
+      </w:r>
+      <w:proofErr w:type="spellEnd"/>
       <w:r>
         <w:rPr>
           <w:rFonts w:ascii="Times New Roman" w:hAnsi="Times New Roman" w:cs="Times New Roman"/>
           <w:i/>
           <w:iCs/>
         </w:rPr>
-        <w:t>PloS One</w:t>
-      </w:r>
-      <w:r>
-        <w:rPr>
-          <w:rFonts w:ascii="Times New Roman" w:hAnsi="Times New Roman" w:cs="Times New Roman"/>
-        </w:rPr>
-        <w:t>. 2019;14(12):e0226765. doi:10.1371/journal.pone.0226765</w:t>
+        <w:t xml:space="preserve"> Res</w:t>
+      </w:r>
+      <w:r>
+        <w:rPr>
+          <w:rFonts w:ascii="Times New Roman" w:hAnsi="Times New Roman" w:cs="Times New Roman"/>
+        </w:rPr>
+        <w:t xml:space="preserve">. </w:t>
+      </w:r>
+      <w:proofErr w:type="gramStart"/>
+      <w:r>
+        <w:rPr>
+          <w:rFonts w:ascii="Times New Roman" w:hAnsi="Times New Roman" w:cs="Times New Roman"/>
+        </w:rPr>
+        <w:t>2022;14:135</w:t>
+      </w:r>
+      <w:proofErr w:type="gramEnd"/>
+      <w:r>
+        <w:rPr>
+          <w:rFonts w:ascii="Times New Roman" w:hAnsi="Times New Roman" w:cs="Times New Roman"/>
+        </w:rPr>
+        <w:t>-155. doi:10.2147/CMAR.S342352</w:t>
       </w:r>
     </w:p>
     <w:p>
@@ -12153,14 +12776,27 @@
         <w:rPr>
           <w:rFonts w:ascii="Times New Roman" w:hAnsi="Times New Roman" w:cs="Times New Roman"/>
         </w:rPr>
-        <w:t>18.</w:t>
+        <w:t>16.</w:t>
       </w:r>
       <w:r>
         <w:rPr>
           <w:rFonts w:ascii="Times New Roman" w:hAnsi="Times New Roman" w:cs="Times New Roman"/>
         </w:rPr>
         <w:tab/>
-        <w:t xml:space="preserve">Xie J, Luo X, Deng X, et al. Advances in artificial intelligence to predict cancer immunotherapy efficacy. </w:t>
+      </w:r>
+      <w:proofErr w:type="spellStart"/>
+      <w:r>
+        <w:rPr>
+          <w:rFonts w:ascii="Times New Roman" w:hAnsi="Times New Roman" w:cs="Times New Roman"/>
+        </w:rPr>
+        <w:t>Nartowt</w:t>
+      </w:r>
+      <w:proofErr w:type="spellEnd"/>
+      <w:r>
+        <w:rPr>
+          <w:rFonts w:ascii="Times New Roman" w:hAnsi="Times New Roman" w:cs="Times New Roman"/>
+        </w:rPr>
+        <w:t xml:space="preserve"> BJ, Hart GR, Muhammad W, Liang Y, Stark GF, Deng J. Robust Machine Learning for Colorectal Cancer Risk Prediction and Stratification. </w:t>
       </w:r>
       <w:r>
         <w:rPr>
@@ -12168,13 +12804,27 @@
           <w:i/>
           <w:iCs/>
         </w:rPr>
-        <w:t>Front Immunol</w:t>
-      </w:r>
-      <w:r>
-        <w:rPr>
-          <w:rFonts w:ascii="Times New Roman" w:hAnsi="Times New Roman" w:cs="Times New Roman"/>
-        </w:rPr>
-        <w:t>. 2022;13:1076883. doi:10.3389/fimmu.2022.1076883</w:t>
+        <w:t>Front Big Data</w:t>
+      </w:r>
+      <w:r>
+        <w:rPr>
+          <w:rFonts w:ascii="Times New Roman" w:hAnsi="Times New Roman" w:cs="Times New Roman"/>
+        </w:rPr>
+        <w:t xml:space="preserve">. </w:t>
+      </w:r>
+      <w:proofErr w:type="gramStart"/>
+      <w:r>
+        <w:rPr>
+          <w:rFonts w:ascii="Times New Roman" w:hAnsi="Times New Roman" w:cs="Times New Roman"/>
+        </w:rPr>
+        <w:t>2020;3:6</w:t>
+      </w:r>
+      <w:proofErr w:type="gramEnd"/>
+      <w:r>
+        <w:rPr>
+          <w:rFonts w:ascii="Times New Roman" w:hAnsi="Times New Roman" w:cs="Times New Roman"/>
+        </w:rPr>
+        <w:t>. doi:10.3389/fdata.2020.00006</w:t>
       </w:r>
     </w:p>
     <w:p>
@@ -12188,21 +12838,225 @@
         <w:rPr>
           <w:rFonts w:ascii="Times New Roman" w:hAnsi="Times New Roman" w:cs="Times New Roman"/>
         </w:rPr>
-        <w:t>19.</w:t>
+        <w:t>17.</w:t>
       </w:r>
       <w:r>
         <w:rPr>
           <w:rFonts w:ascii="Times New Roman" w:hAnsi="Times New Roman" w:cs="Times New Roman"/>
         </w:rPr>
         <w:tab/>
-        <w:t xml:space="preserve">Rakaee M, Adib E, Ricciuti B, et al. Association of Machine Learning-Based Assessment of Tumor-Infiltrating Lymphocytes on Standard Histologic Images With Outcomes of Immunotherapy in Patients With NSCLC. </w:t>
-      </w:r>
+        <w:t xml:space="preserve">Stark GF, Hart GR, </w:t>
+      </w:r>
+      <w:proofErr w:type="spellStart"/>
+      <w:r>
+        <w:rPr>
+          <w:rFonts w:ascii="Times New Roman" w:hAnsi="Times New Roman" w:cs="Times New Roman"/>
+        </w:rPr>
+        <w:t>Nartowt</w:t>
+      </w:r>
+      <w:proofErr w:type="spellEnd"/>
+      <w:r>
+        <w:rPr>
+          <w:rFonts w:ascii="Times New Roman" w:hAnsi="Times New Roman" w:cs="Times New Roman"/>
+        </w:rPr>
+        <w:t xml:space="preserve"> BJ, Deng J. Predicting breast cancer risk using personal health data and machine learning models. </w:t>
+      </w:r>
+      <w:proofErr w:type="spellStart"/>
       <w:r>
         <w:rPr>
           <w:rFonts w:ascii="Times New Roman" w:hAnsi="Times New Roman" w:cs="Times New Roman"/>
           <w:i/>
           <w:iCs/>
         </w:rPr>
+        <w:t>PloS</w:t>
+      </w:r>
+      <w:proofErr w:type="spellEnd"/>
+      <w:r>
+        <w:rPr>
+          <w:rFonts w:ascii="Times New Roman" w:hAnsi="Times New Roman" w:cs="Times New Roman"/>
+          <w:i/>
+          <w:iCs/>
+        </w:rPr>
+        <w:t xml:space="preserve"> One</w:t>
+      </w:r>
+      <w:r>
+        <w:rPr>
+          <w:rFonts w:ascii="Times New Roman" w:hAnsi="Times New Roman" w:cs="Times New Roman"/>
+        </w:rPr>
+        <w:t>. 2019;14(12</w:t>
+      </w:r>
+      <w:proofErr w:type="gramStart"/>
+      <w:r>
+        <w:rPr>
+          <w:rFonts w:ascii="Times New Roman" w:hAnsi="Times New Roman" w:cs="Times New Roman"/>
+        </w:rPr>
+        <w:t>):e</w:t>
+      </w:r>
+      <w:proofErr w:type="gramEnd"/>
+      <w:r>
+        <w:rPr>
+          <w:rFonts w:ascii="Times New Roman" w:hAnsi="Times New Roman" w:cs="Times New Roman"/>
+        </w:rPr>
+        <w:t xml:space="preserve">0226765. </w:t>
+      </w:r>
+      <w:proofErr w:type="gramStart"/>
+      <w:r>
+        <w:rPr>
+          <w:rFonts w:ascii="Times New Roman" w:hAnsi="Times New Roman" w:cs="Times New Roman"/>
+        </w:rPr>
+        <w:t>doi:10.1371/journal.pone</w:t>
+      </w:r>
+      <w:proofErr w:type="gramEnd"/>
+      <w:r>
+        <w:rPr>
+          <w:rFonts w:ascii="Times New Roman" w:hAnsi="Times New Roman" w:cs="Times New Roman"/>
+        </w:rPr>
+        <w:t>.0226765</w:t>
+      </w:r>
+    </w:p>
+    <w:p>
+      <w:pPr>
+        <w:pStyle w:val="Bibliography"/>
+        <w:rPr>
+          <w:rFonts w:ascii="Times New Roman" w:hAnsi="Times New Roman" w:cs="Times New Roman"/>
+        </w:rPr>
+      </w:pPr>
+      <w:r>
+        <w:rPr>
+          <w:rFonts w:ascii="Times New Roman" w:hAnsi="Times New Roman" w:cs="Times New Roman"/>
+        </w:rPr>
+        <w:t>18.</w:t>
+      </w:r>
+      <w:r>
+        <w:rPr>
+          <w:rFonts w:ascii="Times New Roman" w:hAnsi="Times New Roman" w:cs="Times New Roman"/>
+        </w:rPr>
+        <w:tab/>
+      </w:r>
+      <w:proofErr w:type="spellStart"/>
+      <w:r>
+        <w:rPr>
+          <w:rFonts w:ascii="Times New Roman" w:hAnsi="Times New Roman" w:cs="Times New Roman"/>
+        </w:rPr>
+        <w:t>Xie</w:t>
+      </w:r>
+      <w:proofErr w:type="spellEnd"/>
+      <w:r>
+        <w:rPr>
+          <w:rFonts w:ascii="Times New Roman" w:hAnsi="Times New Roman" w:cs="Times New Roman"/>
+        </w:rPr>
+        <w:t xml:space="preserve"> J, Luo X, Deng X, et al. Advances in artificial intelligence to predict cancer immunotherapy efficacy. </w:t>
+      </w:r>
+      <w:r>
+        <w:rPr>
+          <w:rFonts w:ascii="Times New Roman" w:hAnsi="Times New Roman" w:cs="Times New Roman"/>
+          <w:i/>
+          <w:iCs/>
+        </w:rPr>
+        <w:t>Front Immunol</w:t>
+      </w:r>
+      <w:r>
+        <w:rPr>
+          <w:rFonts w:ascii="Times New Roman" w:hAnsi="Times New Roman" w:cs="Times New Roman"/>
+        </w:rPr>
+        <w:t xml:space="preserve">. </w:t>
+      </w:r>
+      <w:proofErr w:type="gramStart"/>
+      <w:r>
+        <w:rPr>
+          <w:rFonts w:ascii="Times New Roman" w:hAnsi="Times New Roman" w:cs="Times New Roman"/>
+        </w:rPr>
+        <w:t>2022;13:1076883</w:t>
+      </w:r>
+      <w:proofErr w:type="gramEnd"/>
+      <w:r>
+        <w:rPr>
+          <w:rFonts w:ascii="Times New Roman" w:hAnsi="Times New Roman" w:cs="Times New Roman"/>
+        </w:rPr>
+        <w:t>. doi:10.3389/fimmu.2022.1076883</w:t>
+      </w:r>
+    </w:p>
+    <w:p>
+      <w:pPr>
+        <w:pStyle w:val="Bibliography"/>
+        <w:rPr>
+          <w:rFonts w:ascii="Times New Roman" w:hAnsi="Times New Roman" w:cs="Times New Roman"/>
+        </w:rPr>
+      </w:pPr>
+      <w:r>
+        <w:rPr>
+          <w:rFonts w:ascii="Times New Roman" w:hAnsi="Times New Roman" w:cs="Times New Roman"/>
+        </w:rPr>
+        <w:t>19.</w:t>
+      </w:r>
+      <w:r>
+        <w:rPr>
+          <w:rFonts w:ascii="Times New Roman" w:hAnsi="Times New Roman" w:cs="Times New Roman"/>
+        </w:rPr>
+        <w:tab/>
+      </w:r>
+      <w:proofErr w:type="spellStart"/>
+      <w:r>
+        <w:rPr>
+          <w:rFonts w:ascii="Times New Roman" w:hAnsi="Times New Roman" w:cs="Times New Roman"/>
+        </w:rPr>
+        <w:t>Rakaee</w:t>
+      </w:r>
+      <w:proofErr w:type="spellEnd"/>
+      <w:r>
+        <w:rPr>
+          <w:rFonts w:ascii="Times New Roman" w:hAnsi="Times New Roman" w:cs="Times New Roman"/>
+        </w:rPr>
+        <w:t xml:space="preserve"> M, </w:t>
+      </w:r>
+      <w:proofErr w:type="spellStart"/>
+      <w:r>
+        <w:rPr>
+          <w:rFonts w:ascii="Times New Roman" w:hAnsi="Times New Roman" w:cs="Times New Roman"/>
+        </w:rPr>
+        <w:t>Adib</w:t>
+      </w:r>
+      <w:proofErr w:type="spellEnd"/>
+      <w:r>
+        <w:rPr>
+          <w:rFonts w:ascii="Times New Roman" w:hAnsi="Times New Roman" w:cs="Times New Roman"/>
+        </w:rPr>
+        <w:t xml:space="preserve"> E, </w:t>
+      </w:r>
+      <w:proofErr w:type="spellStart"/>
+      <w:r>
+        <w:rPr>
+          <w:rFonts w:ascii="Times New Roman" w:hAnsi="Times New Roman" w:cs="Times New Roman"/>
+        </w:rPr>
+        <w:t>Ricciuti</w:t>
+      </w:r>
+      <w:proofErr w:type="spellEnd"/>
+      <w:r>
+        <w:rPr>
+          <w:rFonts w:ascii="Times New Roman" w:hAnsi="Times New Roman" w:cs="Times New Roman"/>
+        </w:rPr>
+        <w:t xml:space="preserve"> B, et al. Association of Machine Learning-Based Assessment of Tumor-Infiltrating Lymphocytes on Standard Histologic Images </w:t>
+      </w:r>
+      <w:proofErr w:type="gramStart"/>
+      <w:r>
+        <w:rPr>
+          <w:rFonts w:ascii="Times New Roman" w:hAnsi="Times New Roman" w:cs="Times New Roman"/>
+        </w:rPr>
+        <w:t>With</w:t>
+      </w:r>
+      <w:proofErr w:type="gramEnd"/>
+      <w:r>
+        <w:rPr>
+          <w:rFonts w:ascii="Times New Roman" w:hAnsi="Times New Roman" w:cs="Times New Roman"/>
+        </w:rPr>
+        <w:t xml:space="preserve"> Outcomes of Immunotherapy in Patients With NSCLC. </w:t>
+      </w:r>
+      <w:r>
+        <w:rPr>
+          <w:rFonts w:ascii="Times New Roman" w:hAnsi="Times New Roman" w:cs="Times New Roman"/>
+          <w:i/>
+          <w:iCs/>
+        </w:rPr>
         <w:t>JAMA Oncol</w:t>
       </w:r>
       <w:r>
@@ -12251,7 +13105,34 @@
           <w:rFonts w:ascii="Times New Roman" w:hAnsi="Times New Roman" w:cs="Times New Roman"/>
         </w:rPr>
         <w:tab/>
-        <w:t xml:space="preserve">Oken MM, Creech RH, Tormey DC, et al. Toxicity and response criteria of the Eastern Cooperative Oncology Group. </w:t>
+      </w:r>
+      <w:proofErr w:type="spellStart"/>
+      <w:r>
+        <w:rPr>
+          <w:rFonts w:ascii="Times New Roman" w:hAnsi="Times New Roman" w:cs="Times New Roman"/>
+        </w:rPr>
+        <w:t>Oken</w:t>
+      </w:r>
+      <w:proofErr w:type="spellEnd"/>
+      <w:r>
+        <w:rPr>
+          <w:rFonts w:ascii="Times New Roman" w:hAnsi="Times New Roman" w:cs="Times New Roman"/>
+        </w:rPr>
+        <w:t xml:space="preserve"> MM, Creech RH, </w:t>
+      </w:r>
+      <w:proofErr w:type="spellStart"/>
+      <w:r>
+        <w:rPr>
+          <w:rFonts w:ascii="Times New Roman" w:hAnsi="Times New Roman" w:cs="Times New Roman"/>
+        </w:rPr>
+        <w:t>Tormey</w:t>
+      </w:r>
+      <w:proofErr w:type="spellEnd"/>
+      <w:r>
+        <w:rPr>
+          <w:rFonts w:ascii="Times New Roman" w:hAnsi="Times New Roman" w:cs="Times New Roman"/>
+        </w:rPr>
+        <w:t xml:space="preserve"> DC, et al. Toxicity and response criteria of the Eastern Cooperative Oncology Group. </w:t>
       </w:r>
       <w:r>
         <w:rPr>
@@ -12266,6 +13147,146 @@
           <w:rFonts w:ascii="Times New Roman" w:hAnsi="Times New Roman" w:cs="Times New Roman"/>
         </w:rPr>
         <w:t>. 1982;5(6):649-655.</w:t>
+      </w:r>
+    </w:p>
+    <w:p>
+      <w:pPr>
+        <w:pStyle w:val="Bibliography"/>
+        <w:rPr>
+          <w:rFonts w:ascii="Times New Roman" w:hAnsi="Times New Roman" w:cs="Times New Roman"/>
+        </w:rPr>
+      </w:pPr>
+      <w:r>
+        <w:rPr>
+          <w:rFonts w:ascii="Times New Roman" w:hAnsi="Times New Roman" w:cs="Times New Roman"/>
+        </w:rPr>
+        <w:t>22.</w:t>
+      </w:r>
+      <w:r>
+        <w:rPr>
+          <w:rFonts w:ascii="Times New Roman" w:hAnsi="Times New Roman" w:cs="Times New Roman"/>
+        </w:rPr>
+        <w:tab/>
+        <w:t xml:space="preserve">Youden WJ. Index for rating diagnostic tests. </w:t>
+      </w:r>
+      <w:r>
+        <w:rPr>
+          <w:rFonts w:ascii="Times New Roman" w:hAnsi="Times New Roman" w:cs="Times New Roman"/>
+          <w:i/>
+          <w:iCs/>
+        </w:rPr>
+        <w:t>Cancer</w:t>
+      </w:r>
+      <w:r>
+        <w:rPr>
+          <w:rFonts w:ascii="Times New Roman" w:hAnsi="Times New Roman" w:cs="Times New Roman"/>
+        </w:rPr>
+        <w:t>. 1950;3(1):32-35. doi:10.1002/1097-0142(1950)3:1&lt;</w:t>
+      </w:r>
+      <w:proofErr w:type="gramStart"/>
+      <w:r>
+        <w:rPr>
+          <w:rFonts w:ascii="Times New Roman" w:hAnsi="Times New Roman" w:cs="Times New Roman"/>
+        </w:rPr>
+        <w:t>32::</w:t>
+      </w:r>
+      <w:proofErr w:type="gramEnd"/>
+      <w:r>
+        <w:rPr>
+          <w:rFonts w:ascii="Times New Roman" w:hAnsi="Times New Roman" w:cs="Times New Roman"/>
+        </w:rPr>
+        <w:t>aid-cncr2820030106&gt;3.0.co;2-3</w:t>
+      </w:r>
+    </w:p>
+    <w:p>
+      <w:pPr>
+        <w:pStyle w:val="Bibliography"/>
+        <w:rPr>
+          <w:rFonts w:ascii="Times New Roman" w:hAnsi="Times New Roman" w:cs="Times New Roman"/>
+        </w:rPr>
+      </w:pPr>
+      <w:r>
+        <w:rPr>
+          <w:rFonts w:ascii="Times New Roman" w:hAnsi="Times New Roman" w:cs="Times New Roman"/>
+        </w:rPr>
+        <w:lastRenderedPageBreak/>
+        <w:t>23.</w:t>
+      </w:r>
+      <w:r>
+        <w:rPr>
+          <w:rFonts w:ascii="Times New Roman" w:hAnsi="Times New Roman" w:cs="Times New Roman"/>
+        </w:rPr>
+        <w:tab/>
+      </w:r>
+      <w:proofErr w:type="spellStart"/>
+      <w:r>
+        <w:rPr>
+          <w:rFonts w:ascii="Times New Roman" w:hAnsi="Times New Roman" w:cs="Times New Roman"/>
+        </w:rPr>
+        <w:t>Ruopp</w:t>
+      </w:r>
+      <w:proofErr w:type="spellEnd"/>
+      <w:r>
+        <w:rPr>
+          <w:rFonts w:ascii="Times New Roman" w:hAnsi="Times New Roman" w:cs="Times New Roman"/>
+        </w:rPr>
+        <w:t xml:space="preserve"> MD, Perkins NJ, Whitcomb BW, </w:t>
+      </w:r>
+      <w:proofErr w:type="spellStart"/>
+      <w:r>
+        <w:rPr>
+          <w:rFonts w:ascii="Times New Roman" w:hAnsi="Times New Roman" w:cs="Times New Roman"/>
+        </w:rPr>
+        <w:t>Schisterman</w:t>
+      </w:r>
+      <w:proofErr w:type="spellEnd"/>
+      <w:r>
+        <w:rPr>
+          <w:rFonts w:ascii="Times New Roman" w:hAnsi="Times New Roman" w:cs="Times New Roman"/>
+        </w:rPr>
+        <w:t xml:space="preserve"> EF. Youden Index and Optimal Cut-Point Estimated from Observations Affected by a Lower Limit of Detection. </w:t>
+      </w:r>
+      <w:proofErr w:type="spellStart"/>
+      <w:r>
+        <w:rPr>
+          <w:rFonts w:ascii="Times New Roman" w:hAnsi="Times New Roman" w:cs="Times New Roman"/>
+          <w:i/>
+          <w:iCs/>
+        </w:rPr>
+        <w:t>Biom</w:t>
+      </w:r>
+      <w:proofErr w:type="spellEnd"/>
+      <w:r>
+        <w:rPr>
+          <w:rFonts w:ascii="Times New Roman" w:hAnsi="Times New Roman" w:cs="Times New Roman"/>
+          <w:i/>
+          <w:iCs/>
+        </w:rPr>
+        <w:t xml:space="preserve"> J </w:t>
+      </w:r>
+      <w:proofErr w:type="spellStart"/>
+      <w:r>
+        <w:rPr>
+          <w:rFonts w:ascii="Times New Roman" w:hAnsi="Times New Roman" w:cs="Times New Roman"/>
+          <w:i/>
+          <w:iCs/>
+        </w:rPr>
+        <w:t>Biom</w:t>
+      </w:r>
+      <w:proofErr w:type="spellEnd"/>
+      <w:r>
+        <w:rPr>
+          <w:rFonts w:ascii="Times New Roman" w:hAnsi="Times New Roman" w:cs="Times New Roman"/>
+          <w:i/>
+          <w:iCs/>
+        </w:rPr>
+        <w:t xml:space="preserve"> Z</w:t>
+      </w:r>
+      <w:r>
+        <w:rPr>
+          <w:rFonts w:ascii="Times New Roman" w:hAnsi="Times New Roman" w:cs="Times New Roman"/>
+        </w:rPr>
+        <w:t>. 2008;50(3):419-430. doi:10.1002/bimj.200710415</w:t>
       </w:r>
     </w:p>
     <w:p>

</xml_diff>

<commit_message>
6 month survival fix negative progression days
</commit_message>
<xml_diff>
--- a/PDL1_Manuscript.docx
+++ b/PDL1_Manuscript.docx
@@ -8301,42 +8301,6 @@
           <w:bCs/>
         </w:rPr>
       </w:pPr>
-    </w:p>
-    <w:p>
-      <w:pPr>
-        <w:rPr>
-          <w:rFonts w:ascii="Times New Roman" w:hAnsi="Times New Roman" w:cs="Times New Roman"/>
-          <w:b/>
-          <w:bCs/>
-        </w:rPr>
-      </w:pPr>
-    </w:p>
-    <w:p>
-      <w:pPr>
-        <w:rPr>
-          <w:rFonts w:ascii="Times New Roman" w:hAnsi="Times New Roman" w:cs="Times New Roman"/>
-          <w:b/>
-          <w:bCs/>
-        </w:rPr>
-      </w:pPr>
-    </w:p>
-    <w:p>
-      <w:pPr>
-        <w:rPr>
-          <w:rFonts w:ascii="Times New Roman" w:hAnsi="Times New Roman" w:cs="Times New Roman"/>
-          <w:b/>
-          <w:bCs/>
-        </w:rPr>
-      </w:pPr>
-    </w:p>
-    <w:p>
-      <w:pPr>
-        <w:rPr>
-          <w:rFonts w:ascii="Times New Roman" w:hAnsi="Times New Roman" w:cs="Times New Roman"/>
-          <w:b/>
-          <w:bCs/>
-        </w:rPr>
-      </w:pPr>
       <w:r>
         <w:rPr>
           <w:rFonts w:ascii="Times New Roman" w:hAnsi="Times New Roman" w:cs="Times New Roman"/>
@@ -8367,47 +8331,15 @@
           <w:b/>
           <w:bCs/>
         </w:rPr>
-        <w:t xml:space="preserve">survival analysis </w:t>
-      </w:r>
-      <w:r>
-        <w:rPr>
-          <w:rFonts w:ascii="Times New Roman" w:hAnsi="Times New Roman" w:cs="Times New Roman"/>
-          <w:b/>
-          <w:bCs/>
-        </w:rPr>
-        <w:t xml:space="preserve">for </w:t>
-      </w:r>
-      <w:r>
-        <w:rPr>
-          <w:rFonts w:ascii="Times New Roman" w:hAnsi="Times New Roman" w:cs="Times New Roman"/>
-          <w:b/>
-          <w:bCs/>
-        </w:rPr>
-        <w:t xml:space="preserve">the first </w:t>
-      </w:r>
-      <w:r>
-        <w:rPr>
-          <w:rFonts w:ascii="Times New Roman" w:hAnsi="Times New Roman" w:cs="Times New Roman"/>
-          <w:b/>
-          <w:bCs/>
-        </w:rPr>
-        <w:t xml:space="preserve">365 days </w:t>
-      </w:r>
-      <w:r>
-        <w:rPr>
-          <w:rFonts w:ascii="Times New Roman" w:hAnsi="Times New Roman" w:cs="Times New Roman"/>
-          <w:b/>
-          <w:bCs/>
-        </w:rPr>
-        <w:t xml:space="preserve">following </w:t>
-      </w:r>
-      <w:r>
-        <w:rPr>
-          <w:rFonts w:ascii="Times New Roman" w:hAnsi="Times New Roman" w:cs="Times New Roman"/>
-          <w:b/>
-          <w:bCs/>
-        </w:rPr>
-        <w:t>first-line therapy initiation</w:t>
+        <w:t xml:space="preserve">6-month PFS following </w:t>
+      </w:r>
+      <w:r>
+        <w:rPr>
+          <w:rFonts w:ascii="Times New Roman" w:hAnsi="Times New Roman" w:cs="Times New Roman"/>
+          <w:b/>
+          <w:bCs/>
+        </w:rPr>
+        <w:t>1:1 propensity score matching without replacement</w:t>
       </w:r>
       <w:r>
         <w:rPr>
@@ -8439,7 +8371,31 @@
           <w:b/>
           <w:bCs/>
         </w:rPr>
-        <w:t xml:space="preserve">. A) </w:t>
+        <w:t>. A)</w:t>
+      </w:r>
+      <w:r>
+        <w:rPr>
+          <w:rFonts w:ascii="Times New Roman" w:hAnsi="Times New Roman" w:cs="Times New Roman"/>
+          <w:b/>
+          <w:bCs/>
+        </w:rPr>
+        <w:t xml:space="preserve"> </w:t>
+      </w:r>
+      <w:r>
+        <w:rPr>
+          <w:rFonts w:ascii="Times New Roman" w:hAnsi="Times New Roman" w:cs="Times New Roman"/>
+          <w:b/>
+          <w:bCs/>
+        </w:rPr>
+        <w:t>All patients; B)</w:t>
+      </w:r>
+      <w:r>
+        <w:rPr>
+          <w:rFonts w:ascii="Times New Roman" w:hAnsi="Times New Roman" w:cs="Times New Roman"/>
+          <w:b/>
+          <w:bCs/>
+        </w:rPr>
+        <w:t xml:space="preserve"> </w:t>
       </w:r>
       <w:r>
         <w:rPr>
@@ -8455,7 +8411,23 @@
           <w:b/>
           <w:bCs/>
         </w:rPr>
-        <w:t xml:space="preserve"> patients with PD-L1 &gt;=50%. C) </w:t>
+        <w:t xml:space="preserve"> patients with PD-L1 &gt;=50%</w:t>
+      </w:r>
+      <w:r>
+        <w:rPr>
+          <w:rFonts w:ascii="Times New Roman" w:hAnsi="Times New Roman" w:cs="Times New Roman"/>
+          <w:b/>
+          <w:bCs/>
+        </w:rPr>
+        <w:t>;</w:t>
+      </w:r>
+      <w:r>
+        <w:rPr>
+          <w:rFonts w:ascii="Times New Roman" w:hAnsi="Times New Roman" w:cs="Times New Roman"/>
+          <w:b/>
+          <w:bCs/>
+        </w:rPr>
+        <w:t xml:space="preserve"> C) </w:t>
       </w:r>
       <w:r>
         <w:rPr>
@@ -8473,325 +8445,6 @@
         </w:rPr>
         <w:t xml:space="preserve">nly using patients with PD-L1 &lt; 50%. </w:t>
       </w:r>
-    </w:p>
-    <w:p>
-      <w:pPr>
-        <w:pBdr>
-          <w:bottom w:val="single" w:sz="12" w:space="1" w:color="auto"/>
-        </w:pBdr>
-        <w:rPr>
-          <w:rFonts w:ascii="Times New Roman" w:hAnsi="Times New Roman" w:cs="Times New Roman"/>
-          <w:b/>
-          <w:bCs/>
-        </w:rPr>
-      </w:pPr>
-    </w:p>
-    <w:tbl>
-      <w:tblPr>
-        <w:tblStyle w:val="TableGrid"/>
-        <w:tblW w:w="0" w:type="auto"/>
-        <w:tblInd w:w="-5" w:type="dxa"/>
-        <w:tblLook w:val="04A0" w:firstRow="1" w:lastRow="0" w:firstColumn="1" w:lastColumn="0" w:noHBand="0" w:noVBand="1"/>
-      </w:tblPr>
-      <w:tblGrid>
-        <w:gridCol w:w="3060"/>
-        <w:gridCol w:w="4770"/>
-        <w:gridCol w:w="2070"/>
-      </w:tblGrid>
-      <w:tr>
-        <w:tc>
-          <w:tcPr>
-            <w:tcW w:w="3060" w:type="dxa"/>
-          </w:tcPr>
-          <w:p>
-            <w:pPr>
-              <w:jc w:val="center"/>
-              <w:rPr>
-                <w:rFonts w:ascii="Times New Roman" w:hAnsi="Times New Roman" w:cs="Times New Roman"/>
-                <w:b/>
-                <w:bCs/>
-                <w:lang w:val="it-IT"/>
-              </w:rPr>
-            </w:pPr>
-            <w:proofErr w:type="spellStart"/>
-            <w:r>
-              <w:rPr>
-                <w:rFonts w:ascii="Times New Roman" w:hAnsi="Times New Roman" w:cs="Times New Roman"/>
-                <w:b/>
-                <w:bCs/>
-                <w:lang w:val="it-IT"/>
-              </w:rPr>
-              <w:t>Outcome</w:t>
-            </w:r>
-            <w:proofErr w:type="spellEnd"/>
-          </w:p>
-        </w:tc>
-        <w:tc>
-          <w:tcPr>
-            <w:tcW w:w="4770" w:type="dxa"/>
-          </w:tcPr>
-          <w:p>
-            <w:pPr>
-              <w:jc w:val="center"/>
-              <w:rPr>
-                <w:rFonts w:ascii="Times New Roman" w:hAnsi="Times New Roman" w:cs="Times New Roman"/>
-                <w:b/>
-                <w:bCs/>
-                <w:vertAlign w:val="subscript"/>
-                <w:lang w:val="it-IT"/>
-              </w:rPr>
-            </w:pPr>
-            <w:r>
-              <w:rPr>
-                <w:rFonts w:ascii="Times New Roman" w:hAnsi="Times New Roman" w:cs="Times New Roman"/>
-                <w:b/>
-                <w:bCs/>
-                <w:lang w:val="it-IT"/>
-              </w:rPr>
-              <w:t>ATE</w:t>
-            </w:r>
-            <w:r>
-              <w:rPr>
-                <w:rFonts w:ascii="Times New Roman" w:hAnsi="Times New Roman" w:cs="Times New Roman"/>
-                <w:b/>
-                <w:bCs/>
-                <w:lang w:val="it-IT"/>
-              </w:rPr>
-              <w:t xml:space="preserve"> with 95% CI</w:t>
-            </w:r>
-          </w:p>
-        </w:tc>
-        <w:tc>
-          <w:tcPr>
-            <w:tcW w:w="2070" w:type="dxa"/>
-          </w:tcPr>
-          <w:p>
-            <w:pPr>
-              <w:jc w:val="center"/>
-              <w:rPr>
-                <w:rFonts w:ascii="Times New Roman" w:hAnsi="Times New Roman" w:cs="Times New Roman"/>
-                <w:b/>
-                <w:bCs/>
-              </w:rPr>
-            </w:pPr>
-            <w:r>
-              <w:rPr>
-                <w:rFonts w:ascii="Times New Roman" w:hAnsi="Times New Roman" w:cs="Times New Roman"/>
-                <w:b/>
-                <w:bCs/>
-              </w:rPr>
-              <w:t>p-value</w:t>
-            </w:r>
-          </w:p>
-        </w:tc>
-      </w:tr>
-      <w:tr>
-        <w:tc>
-          <w:tcPr>
-            <w:tcW w:w="3060" w:type="dxa"/>
-          </w:tcPr>
-          <w:p>
-            <w:pPr>
-              <w:rPr>
-                <w:rFonts w:ascii="Times New Roman" w:hAnsi="Times New Roman" w:cs="Times New Roman"/>
-                <w:b/>
-                <w:bCs/>
-                <w:i/>
-                <w:iCs/>
-              </w:rPr>
-            </w:pPr>
-            <w:r>
-              <w:rPr>
-                <w:rFonts w:ascii="Times New Roman" w:hAnsi="Times New Roman" w:cs="Times New Roman"/>
-                <w:b/>
-                <w:bCs/>
-                <w:i/>
-                <w:iCs/>
-              </w:rPr>
-              <w:t>6-month PFS</w:t>
-            </w:r>
-          </w:p>
-        </w:tc>
-        <w:tc>
-          <w:tcPr>
-            <w:tcW w:w="4770" w:type="dxa"/>
-          </w:tcPr>
-          <w:p>
-            <w:pPr>
-              <w:jc w:val="center"/>
-              <w:rPr>
-                <w:rFonts w:ascii="Times New Roman" w:hAnsi="Times New Roman" w:cs="Times New Roman"/>
-              </w:rPr>
-            </w:pPr>
-          </w:p>
-        </w:tc>
-        <w:tc>
-          <w:tcPr>
-            <w:tcW w:w="2070" w:type="dxa"/>
-          </w:tcPr>
-          <w:p>
-            <w:pPr>
-              <w:jc w:val="center"/>
-              <w:rPr>
-                <w:rFonts w:ascii="Times New Roman" w:hAnsi="Times New Roman" w:cs="Times New Roman"/>
-              </w:rPr>
-            </w:pPr>
-          </w:p>
-        </w:tc>
-      </w:tr>
-      <w:tr>
-        <w:tc>
-          <w:tcPr>
-            <w:tcW w:w="3060" w:type="dxa"/>
-          </w:tcPr>
-          <w:p>
-            <w:pPr>
-              <w:jc w:val="right"/>
-              <w:rPr>
-                <w:rFonts w:ascii="Times New Roman" w:hAnsi="Times New Roman" w:cs="Times New Roman"/>
-              </w:rPr>
-            </w:pPr>
-            <w:r>
-              <w:rPr>
-                <w:rFonts w:ascii="Times New Roman" w:hAnsi="Times New Roman" w:cs="Times New Roman"/>
-              </w:rPr>
-              <w:t>PSM</w:t>
-            </w:r>
-          </w:p>
-        </w:tc>
-        <w:tc>
-          <w:tcPr>
-            <w:tcW w:w="4770" w:type="dxa"/>
-          </w:tcPr>
-          <w:p>
-            <w:pPr>
-              <w:jc w:val="center"/>
-              <w:rPr>
-                <w:rFonts w:ascii="Times New Roman" w:hAnsi="Times New Roman" w:cs="Times New Roman"/>
-              </w:rPr>
-            </w:pPr>
-          </w:p>
-        </w:tc>
-        <w:tc>
-          <w:tcPr>
-            <w:tcW w:w="2070" w:type="dxa"/>
-          </w:tcPr>
-          <w:p>
-            <w:pPr>
-              <w:jc w:val="center"/>
-              <w:rPr>
-                <w:rFonts w:ascii="Times New Roman" w:hAnsi="Times New Roman" w:cs="Times New Roman"/>
-              </w:rPr>
-            </w:pPr>
-          </w:p>
-        </w:tc>
-      </w:tr>
-      <w:tr>
-        <w:tc>
-          <w:tcPr>
-            <w:tcW w:w="3060" w:type="dxa"/>
-          </w:tcPr>
-          <w:p>
-            <w:pPr>
-              <w:jc w:val="right"/>
-              <w:rPr>
-                <w:rFonts w:ascii="Times New Roman" w:hAnsi="Times New Roman" w:cs="Times New Roman"/>
-              </w:rPr>
-            </w:pPr>
-            <w:r>
-              <w:rPr>
-                <w:rFonts w:ascii="Times New Roman" w:hAnsi="Times New Roman" w:cs="Times New Roman"/>
-              </w:rPr>
-              <w:t>IPTW</w:t>
-            </w:r>
-          </w:p>
-        </w:tc>
-        <w:tc>
-          <w:tcPr>
-            <w:tcW w:w="4770" w:type="dxa"/>
-          </w:tcPr>
-          <w:p>
-            <w:pPr>
-              <w:jc w:val="center"/>
-              <w:rPr>
-                <w:rFonts w:ascii="Times New Roman" w:hAnsi="Times New Roman" w:cs="Times New Roman"/>
-              </w:rPr>
-            </w:pPr>
-          </w:p>
-        </w:tc>
-        <w:tc>
-          <w:tcPr>
-            <w:tcW w:w="2070" w:type="dxa"/>
-          </w:tcPr>
-          <w:p>
-            <w:pPr>
-              <w:jc w:val="center"/>
-              <w:rPr>
-                <w:rFonts w:ascii="Times New Roman" w:hAnsi="Times New Roman" w:cs="Times New Roman"/>
-              </w:rPr>
-            </w:pPr>
-          </w:p>
-        </w:tc>
-      </w:tr>
-      <w:tr>
-        <w:tc>
-          <w:tcPr>
-            <w:tcW w:w="3060" w:type="dxa"/>
-          </w:tcPr>
-          <w:p>
-            <w:pPr>
-              <w:jc w:val="right"/>
-              <w:rPr>
-                <w:rFonts w:ascii="Times New Roman" w:hAnsi="Times New Roman" w:cs="Times New Roman"/>
-              </w:rPr>
-            </w:pPr>
-            <w:r>
-              <w:rPr>
-                <w:rFonts w:ascii="Times New Roman" w:hAnsi="Times New Roman" w:cs="Times New Roman"/>
-              </w:rPr>
-              <w:t>IPTWRA</w:t>
-            </w:r>
-          </w:p>
-        </w:tc>
-        <w:tc>
-          <w:tcPr>
-            <w:tcW w:w="4770" w:type="dxa"/>
-          </w:tcPr>
-          <w:p>
-            <w:pPr>
-              <w:jc w:val="center"/>
-              <w:rPr>
-                <w:rFonts w:ascii="Times New Roman" w:hAnsi="Times New Roman" w:cs="Times New Roman"/>
-              </w:rPr>
-            </w:pPr>
-          </w:p>
-        </w:tc>
-        <w:tc>
-          <w:tcPr>
-            <w:tcW w:w="2070" w:type="dxa"/>
-          </w:tcPr>
-          <w:p>
-            <w:pPr>
-              <w:jc w:val="center"/>
-              <w:rPr>
-                <w:rFonts w:ascii="Times New Roman" w:hAnsi="Times New Roman" w:cs="Times New Roman"/>
-              </w:rPr>
-            </w:pPr>
-          </w:p>
-        </w:tc>
-      </w:tr>
-    </w:tbl>
-    <w:p>
-      <w:pPr>
-        <w:pBdr>
-          <w:bottom w:val="single" w:sz="12" w:space="1" w:color="auto"/>
-        </w:pBdr>
-        <w:rPr>
-          <w:rFonts w:ascii="Times New Roman" w:hAnsi="Times New Roman" w:cs="Times New Roman"/>
-          <w:b/>
-          <w:bCs/>
-        </w:rPr>
-      </w:pPr>
     </w:p>
     <w:p>
       <w:pPr>
@@ -9074,21 +8727,13 @@
               <w:jc w:val="center"/>
               <w:rPr>
                 <w:rFonts w:ascii="Times New Roman" w:hAnsi="Times New Roman" w:cs="Times New Roman"/>
-                <w:b/>
-                <w:bCs/>
-                <w:i/>
-                <w:iCs/>
-              </w:rPr>
-            </w:pPr>
-            <w:r>
-              <w:rPr>
-                <w:rFonts w:ascii="Times New Roman" w:hAnsi="Times New Roman" w:cs="Times New Roman"/>
-                <w:b/>
-                <w:bCs/>
-                <w:i/>
-                <w:iCs/>
-              </w:rPr>
-              <w:t>6-month PFS</w:t>
+              </w:rPr>
+            </w:pPr>
+            <w:r>
+              <w:rPr>
+                <w:rFonts w:ascii="Times New Roman" w:hAnsi="Times New Roman" w:cs="Times New Roman"/>
+              </w:rPr>
+              <w:t>All Patients</w:t>
             </w:r>
           </w:p>
         </w:tc>
@@ -9186,7 +8831,19 @@
               <w:rPr>
                 <w:rFonts w:ascii="Times New Roman" w:hAnsi="Times New Roman" w:cs="Times New Roman"/>
               </w:rPr>
-              <w:t>All Patients</w:t>
+              <w:t>PD</w:t>
+            </w:r>
+            <w:r>
+              <w:rPr>
+                <w:rFonts w:ascii="Times New Roman" w:hAnsi="Times New Roman" w:cs="Times New Roman"/>
+              </w:rPr>
+              <w:t>-</w:t>
+            </w:r>
+            <w:r>
+              <w:rPr>
+                <w:rFonts w:ascii="Times New Roman" w:hAnsi="Times New Roman" w:cs="Times New Roman"/>
+              </w:rPr>
+              <w:t>L1 &gt;= 50%</w:t>
             </w:r>
           </w:p>
         </w:tc>
@@ -9248,6 +8905,7 @@
           </w:tcPr>
           <w:p>
             <w:pPr>
+              <w:jc w:val="center"/>
               <w:rPr>
                 <w:rFonts w:ascii="Times New Roman" w:hAnsi="Times New Roman" w:cs="Times New Roman"/>
               </w:rPr>
@@ -9284,113 +8942,8 @@
               <w:rPr>
                 <w:rFonts w:ascii="Times New Roman" w:hAnsi="Times New Roman" w:cs="Times New Roman"/>
               </w:rPr>
-              <w:t>PD</w:t>
-            </w:r>
-            <w:r>
-              <w:rPr>
-                <w:rFonts w:ascii="Times New Roman" w:hAnsi="Times New Roman" w:cs="Times New Roman"/>
-              </w:rPr>
-              <w:t>-</w:t>
-            </w:r>
-            <w:r>
-              <w:rPr>
-                <w:rFonts w:ascii="Times New Roman" w:hAnsi="Times New Roman" w:cs="Times New Roman"/>
-              </w:rPr>
-              <w:t>L1 &gt;= 50%</w:t>
-            </w:r>
-          </w:p>
-        </w:tc>
-        <w:tc>
-          <w:tcPr>
-            <w:tcW w:w="810" w:type="dxa"/>
-          </w:tcPr>
-          <w:p>
-            <w:pPr>
-              <w:jc w:val="center"/>
-              <w:rPr>
-                <w:rFonts w:ascii="Times New Roman" w:hAnsi="Times New Roman" w:cs="Times New Roman"/>
-              </w:rPr>
-            </w:pPr>
-          </w:p>
-        </w:tc>
-        <w:tc>
-          <w:tcPr>
-            <w:tcW w:w="720" w:type="dxa"/>
-          </w:tcPr>
-          <w:p>
-            <w:pPr>
-              <w:jc w:val="center"/>
-              <w:rPr>
-                <w:rFonts w:ascii="Times New Roman" w:hAnsi="Times New Roman" w:cs="Times New Roman"/>
-              </w:rPr>
-            </w:pPr>
-          </w:p>
-        </w:tc>
-        <w:tc>
-          <w:tcPr>
-            <w:tcW w:w="1890" w:type="dxa"/>
-          </w:tcPr>
-          <w:p>
-            <w:pPr>
-              <w:jc w:val="center"/>
-              <w:rPr>
-                <w:rFonts w:ascii="Times New Roman" w:hAnsi="Times New Roman" w:cs="Times New Roman"/>
-              </w:rPr>
-            </w:pPr>
-          </w:p>
-        </w:tc>
-        <w:tc>
-          <w:tcPr>
-            <w:tcW w:w="1800" w:type="dxa"/>
-          </w:tcPr>
-          <w:p>
-            <w:pPr>
-              <w:jc w:val="center"/>
-              <w:rPr>
-                <w:rFonts w:ascii="Times New Roman" w:hAnsi="Times New Roman" w:cs="Times New Roman"/>
-              </w:rPr>
-            </w:pPr>
-          </w:p>
-        </w:tc>
-        <w:tc>
-          <w:tcPr>
-            <w:tcW w:w="1960" w:type="dxa"/>
-          </w:tcPr>
-          <w:p>
-            <w:pPr>
-              <w:jc w:val="center"/>
-              <w:rPr>
-                <w:rFonts w:ascii="Times New Roman" w:hAnsi="Times New Roman" w:cs="Times New Roman"/>
-              </w:rPr>
-            </w:pPr>
-          </w:p>
-        </w:tc>
-        <w:tc>
-          <w:tcPr>
-            <w:tcW w:w="1012" w:type="dxa"/>
-          </w:tcPr>
-          <w:p>
-            <w:pPr>
-              <w:jc w:val="center"/>
-              <w:rPr>
-                <w:rFonts w:ascii="Times New Roman" w:hAnsi="Times New Roman" w:cs="Times New Roman"/>
-              </w:rPr>
-            </w:pPr>
-          </w:p>
-        </w:tc>
-      </w:tr>
-      <w:tr>
-        <w:tc>
-          <w:tcPr>
-            <w:tcW w:w="1710" w:type="dxa"/>
-          </w:tcPr>
-          <w:p>
-            <w:pPr>
-              <w:jc w:val="center"/>
-              <w:rPr>
-                <w:rFonts w:ascii="Times New Roman" w:hAnsi="Times New Roman" w:cs="Times New Roman"/>
-              </w:rPr>
-            </w:pPr>
+              <w:t xml:space="preserve">1% &lt; </w:t>
+            </w:r>
             <w:r>
               <w:rPr>
                 <w:rFonts w:ascii="Times New Roman" w:hAnsi="Times New Roman" w:cs="Times New Roman"/>
@@ -9533,16 +9086,7 @@
           <w:b/>
           <w:bCs/>
         </w:rPr>
-        <w:t xml:space="preserve">Survival time is calculated as days from initiation of first-line </w:t>
-      </w:r>
-      <w:r>
-        <w:rPr>
-          <w:rFonts w:ascii="Times New Roman" w:hAnsi="Times New Roman" w:cs="Times New Roman"/>
-          <w:b/>
-          <w:bCs/>
-        </w:rPr>
-        <w:lastRenderedPageBreak/>
-        <w:t xml:space="preserve">therapy. </w:t>
+        <w:t xml:space="preserve">Survival time is calculated as days from initiation of first-line therapy. </w:t>
       </w:r>
       <w:r>
         <w:rPr>
@@ -9574,7 +9118,39 @@
           <w:b/>
           <w:bCs/>
         </w:rPr>
-        <w:t xml:space="preserve"> Hazard ratio is calculated with respect to IO monotherapy versus chemotherapy.</w:t>
+        <w:t xml:space="preserve"> Hazard ratio</w:t>
+      </w:r>
+      <w:r>
+        <w:rPr>
+          <w:rFonts w:ascii="Times New Roman" w:hAnsi="Times New Roman" w:cs="Times New Roman"/>
+          <w:b/>
+          <w:bCs/>
+        </w:rPr>
+        <w:t xml:space="preserve"> and associated p-values</w:t>
+      </w:r>
+      <w:r>
+        <w:rPr>
+          <w:rFonts w:ascii="Times New Roman" w:hAnsi="Times New Roman" w:cs="Times New Roman"/>
+          <w:b/>
+          <w:bCs/>
+        </w:rPr>
+        <w:t xml:space="preserve"> </w:t>
+      </w:r>
+      <w:r>
+        <w:rPr>
+          <w:rFonts w:ascii="Times New Roman" w:hAnsi="Times New Roman" w:cs="Times New Roman"/>
+          <w:b/>
+          <w:bCs/>
+        </w:rPr>
+        <w:t>are</w:t>
+      </w:r>
+      <w:r>
+        <w:rPr>
+          <w:rFonts w:ascii="Times New Roman" w:hAnsi="Times New Roman" w:cs="Times New Roman"/>
+          <w:b/>
+          <w:bCs/>
+        </w:rPr>
+        <w:t xml:space="preserve"> calculated with respect to IO monotherapy versus chemotherapy.</w:t>
       </w:r>
       <w:r>
         <w:rPr>
@@ -9600,27 +9176,6 @@
         </w:rPr>
         <w:t xml:space="preserve">restricted mean survival time. </w:t>
       </w:r>
-    </w:p>
-    <w:p>
-      <w:pPr>
-        <w:pBdr>
-          <w:bottom w:val="single" w:sz="12" w:space="1" w:color="auto"/>
-        </w:pBdr>
-        <w:rPr>
-          <w:rFonts w:ascii="Times New Roman" w:hAnsi="Times New Roman" w:cs="Times New Roman"/>
-          <w:b/>
-          <w:bCs/>
-        </w:rPr>
-      </w:pPr>
-    </w:p>
-    <w:p>
-      <w:pPr>
-        <w:rPr>
-          <w:rFonts w:ascii="Times New Roman" w:hAnsi="Times New Roman" w:cs="Times New Roman"/>
-          <w:b/>
-          <w:bCs/>
-        </w:rPr>
-      </w:pPr>
     </w:p>
     <w:p>
       <w:pPr>
@@ -9667,53 +9222,6 @@
           <w:rFonts w:ascii="Times New Roman" w:hAnsi="Times New Roman" w:cs="Times New Roman"/>
         </w:rPr>
       </w:pPr>
-      <w:r>
-        <w:rPr>
-          <w:rFonts w:ascii="Times New Roman" w:hAnsi="Times New Roman" w:cs="Times New Roman"/>
-          <w:noProof/>
-        </w:rPr>
-        <w:drawing>
-          <wp:inline distT="0" distB="0" distL="0" distR="0" wp14:anchorId="50B3002D" wp14:editId="43C2113F">
-            <wp:extent cx="4401178" cy="2932490"/>
-            <wp:effectExtent l="0" t="0" r="6350" b="1270"/>
-            <wp:docPr id="1482873439" name="Picture 1" descr="A graph with a red line&#10;&#10;Description automatically generated"/>
-            <wp:cNvGraphicFramePr>
-              <a:graphicFrameLocks xmlns:a="http://schemas.openxmlformats.org/drawingml/2006/main" noChangeAspect="1"/>
-            </wp:cNvGraphicFramePr>
-            <a:graphic xmlns:a="http://schemas.openxmlformats.org/drawingml/2006/main">
-              <a:graphicData uri="http://schemas.openxmlformats.org/drawingml/2006/picture">
-                <pic:pic xmlns:pic="http://schemas.openxmlformats.org/drawingml/2006/picture">
-                  <pic:nvPicPr>
-                    <pic:cNvPr id="1482873439" name="Picture 1" descr="A graph with a red line&#10;&#10;Description automatically generated"/>
-                    <pic:cNvPicPr/>
-                  </pic:nvPicPr>
-                  <pic:blipFill>
-                    <a:blip r:embed="rId6" cstate="print">
-                      <a:extLst>
-                        <a:ext uri="{28A0092B-C50C-407E-A947-70E740481C1C}">
-                          <a14:useLocalDpi xmlns:a14="http://schemas.microsoft.com/office/drawing/2010/main" val="0"/>
-                        </a:ext>
-                      </a:extLst>
-                    </a:blip>
-                    <a:stretch>
-                      <a:fillRect/>
-                    </a:stretch>
-                  </pic:blipFill>
-                  <pic:spPr>
-                    <a:xfrm>
-                      <a:off x="0" y="0"/>
-                      <a:ext cx="4423216" cy="2947174"/>
-                    </a:xfrm>
-                    <a:prstGeom prst="rect">
-                      <a:avLst/>
-                    </a:prstGeom>
-                  </pic:spPr>
-                </pic:pic>
-              </a:graphicData>
-            </a:graphic>
-          </wp:inline>
-        </w:drawing>
-      </w:r>
     </w:p>
     <w:p>
       <w:pPr>
@@ -9768,83 +9276,82 @@
       <w:tblPr>
         <w:tblStyle w:val="TableGrid"/>
         <w:tblW w:w="0" w:type="auto"/>
+        <w:jc w:val="center"/>
         <w:tblLook w:val="04A0" w:firstRow="1" w:lastRow="0" w:firstColumn="1" w:lastColumn="0" w:noHBand="0" w:noVBand="1"/>
       </w:tblPr>
       <w:tblGrid>
-        <w:gridCol w:w="4585"/>
-        <w:gridCol w:w="3780"/>
-        <w:gridCol w:w="1080"/>
+        <w:gridCol w:w="2155"/>
+        <w:gridCol w:w="2880"/>
+        <w:gridCol w:w="1710"/>
       </w:tblGrid>
       <w:tr>
-        <w:tc>
-          <w:tcPr>
-            <w:tcW w:w="4585" w:type="dxa"/>
-          </w:tcPr>
-          <w:p>
-            <w:pPr>
-              <w:rPr>
-                <w:rFonts w:ascii="Times New Roman" w:hAnsi="Times New Roman" w:cs="Times New Roman"/>
-                <w:b/>
-                <w:bCs/>
-              </w:rPr>
-            </w:pPr>
-            <w:r>
-              <w:rPr>
-                <w:rFonts w:ascii="Times New Roman" w:hAnsi="Times New Roman" w:cs="Times New Roman"/>
-                <w:b/>
-                <w:bCs/>
-              </w:rPr>
-              <w:t>Outcome</w:t>
-            </w:r>
-            <w:r>
-              <w:rPr>
-                <w:rFonts w:ascii="Times New Roman" w:hAnsi="Times New Roman" w:cs="Times New Roman"/>
-                <w:b/>
-                <w:bCs/>
-              </w:rPr>
-              <w:t xml:space="preserve"> of Interest</w:t>
-            </w:r>
-          </w:p>
-        </w:tc>
-        <w:tc>
-          <w:tcPr>
-            <w:tcW w:w="3780" w:type="dxa"/>
-          </w:tcPr>
-          <w:p>
-            <w:pPr>
-              <w:jc w:val="center"/>
-              <w:rPr>
-                <w:rFonts w:ascii="Times New Roman" w:hAnsi="Times New Roman" w:cs="Times New Roman"/>
-              </w:rPr>
-            </w:pPr>
-            <w:r>
-              <w:rPr>
-                <w:rFonts w:ascii="Times New Roman" w:hAnsi="Times New Roman" w:cs="Times New Roman"/>
-              </w:rPr>
-              <w:t>Result</w:t>
-            </w:r>
-            <w:r>
-              <w:rPr>
-                <w:rFonts w:ascii="Times New Roman" w:hAnsi="Times New Roman" w:cs="Times New Roman"/>
-              </w:rPr>
-              <w:t xml:space="preserve"> with 95% CI</w:t>
-            </w:r>
-          </w:p>
-        </w:tc>
-        <w:tc>
-          <w:tcPr>
-            <w:tcW w:w="1080" w:type="dxa"/>
-          </w:tcPr>
-          <w:p>
-            <w:pPr>
-              <w:jc w:val="center"/>
-              <w:rPr>
-                <w:rFonts w:ascii="Times New Roman" w:hAnsi="Times New Roman" w:cs="Times New Roman"/>
-              </w:rPr>
-            </w:pPr>
-            <w:r>
-              <w:rPr>
-                <w:rFonts w:ascii="Times New Roman" w:hAnsi="Times New Roman" w:cs="Times New Roman"/>
+        <w:trPr>
+          <w:jc w:val="center"/>
+        </w:trPr>
+        <w:tc>
+          <w:tcPr>
+            <w:tcW w:w="2155" w:type="dxa"/>
+          </w:tcPr>
+          <w:p>
+            <w:pPr>
+              <w:jc w:val="center"/>
+              <w:rPr>
+                <w:rFonts w:ascii="Times New Roman" w:hAnsi="Times New Roman" w:cs="Times New Roman"/>
+                <w:i/>
+                <w:iCs/>
+              </w:rPr>
+            </w:pPr>
+            <w:r>
+              <w:rPr>
+                <w:rFonts w:ascii="Times New Roman" w:hAnsi="Times New Roman" w:cs="Times New Roman"/>
+                <w:i/>
+                <w:iCs/>
+              </w:rPr>
+              <w:t xml:space="preserve">PD-L1 Bandwidth </w:t>
+            </w:r>
+          </w:p>
+        </w:tc>
+        <w:tc>
+          <w:tcPr>
+            <w:tcW w:w="2880" w:type="dxa"/>
+          </w:tcPr>
+          <w:p>
+            <w:pPr>
+              <w:jc w:val="center"/>
+              <w:rPr>
+                <w:rFonts w:ascii="Times New Roman" w:hAnsi="Times New Roman" w:cs="Times New Roman"/>
+                <w:i/>
+                <w:iCs/>
+              </w:rPr>
+            </w:pPr>
+            <w:r>
+              <w:rPr>
+                <w:rFonts w:ascii="Times New Roman" w:hAnsi="Times New Roman" w:cs="Times New Roman"/>
+                <w:i/>
+                <w:iCs/>
+              </w:rPr>
+              <w:t>ITT Statistic with 95% CI</w:t>
+            </w:r>
+          </w:p>
+        </w:tc>
+        <w:tc>
+          <w:tcPr>
+            <w:tcW w:w="1710" w:type="dxa"/>
+          </w:tcPr>
+          <w:p>
+            <w:pPr>
+              <w:jc w:val="center"/>
+              <w:rPr>
+                <w:rFonts w:ascii="Times New Roman" w:hAnsi="Times New Roman" w:cs="Times New Roman"/>
+                <w:i/>
+                <w:iCs/>
+              </w:rPr>
+            </w:pPr>
+            <w:r>
+              <w:rPr>
+                <w:rFonts w:ascii="Times New Roman" w:hAnsi="Times New Roman" w:cs="Times New Roman"/>
+                <w:i/>
+                <w:iCs/>
               </w:rPr>
               <w:t>p-value</w:t>
             </w:r>
@@ -9852,44 +9359,44 @@
         </w:tc>
       </w:tr>
       <w:tr>
-        <w:tc>
-          <w:tcPr>
-            <w:tcW w:w="4585" w:type="dxa"/>
-          </w:tcPr>
-          <w:p>
-            <w:pPr>
-              <w:rPr>
-                <w:rFonts w:ascii="Times New Roman" w:hAnsi="Times New Roman" w:cs="Times New Roman"/>
-                <w:i/>
-                <w:iCs/>
-              </w:rPr>
-            </w:pPr>
-            <w:r>
-              <w:rPr>
-                <w:rFonts w:ascii="Times New Roman" w:hAnsi="Times New Roman" w:cs="Times New Roman"/>
-                <w:i/>
-                <w:iCs/>
-              </w:rPr>
-              <w:t>6-month PFS</w:t>
-            </w:r>
-          </w:p>
-        </w:tc>
-        <w:tc>
-          <w:tcPr>
-            <w:tcW w:w="3780" w:type="dxa"/>
-          </w:tcPr>
-          <w:p>
-            <w:pPr>
-              <w:jc w:val="center"/>
-              <w:rPr>
-                <w:rFonts w:ascii="Times New Roman" w:hAnsi="Times New Roman" w:cs="Times New Roman"/>
-              </w:rPr>
-            </w:pPr>
-          </w:p>
-        </w:tc>
-        <w:tc>
-          <w:tcPr>
-            <w:tcW w:w="1080" w:type="dxa"/>
+        <w:trPr>
+          <w:jc w:val="center"/>
+        </w:trPr>
+        <w:tc>
+          <w:tcPr>
+            <w:tcW w:w="2155" w:type="dxa"/>
+          </w:tcPr>
+          <w:p>
+            <w:pPr>
+              <w:jc w:val="center"/>
+              <w:rPr>
+                <w:rFonts w:ascii="Times New Roman" w:hAnsi="Times New Roman" w:cs="Times New Roman"/>
+              </w:rPr>
+            </w:pPr>
+            <w:r>
+              <w:rPr>
+                <w:rFonts w:ascii="Times New Roman" w:hAnsi="Times New Roman" w:cs="Times New Roman"/>
+              </w:rPr>
+              <w:t>[0.4, 0.6]</w:t>
+            </w:r>
+          </w:p>
+        </w:tc>
+        <w:tc>
+          <w:tcPr>
+            <w:tcW w:w="2880" w:type="dxa"/>
+          </w:tcPr>
+          <w:p>
+            <w:pPr>
+              <w:jc w:val="center"/>
+              <w:rPr>
+                <w:rFonts w:ascii="Times New Roman" w:hAnsi="Times New Roman" w:cs="Times New Roman"/>
+              </w:rPr>
+            </w:pPr>
+          </w:p>
+        </w:tc>
+        <w:tc>
+          <w:tcPr>
+            <w:tcW w:w="1710" w:type="dxa"/>
           </w:tcPr>
           <w:p>
             <w:pPr>
@@ -9902,126 +9409,103 @@
         </w:tc>
       </w:tr>
       <w:tr>
-        <w:tc>
-          <w:tcPr>
-            <w:tcW w:w="4585" w:type="dxa"/>
-          </w:tcPr>
-          <w:p>
-            <w:pPr>
-              <w:jc w:val="right"/>
-              <w:rPr>
-                <w:rFonts w:ascii="Times New Roman" w:hAnsi="Times New Roman" w:cs="Times New Roman"/>
-              </w:rPr>
-            </w:pPr>
-            <w:r>
-              <w:rPr>
-                <w:rFonts w:ascii="Times New Roman" w:hAnsi="Times New Roman" w:cs="Times New Roman"/>
-              </w:rPr>
-              <w:t>Adjusted Logistic Regression</w:t>
-            </w:r>
-          </w:p>
-        </w:tc>
-        <w:tc>
-          <w:tcPr>
-            <w:tcW w:w="3780" w:type="dxa"/>
-          </w:tcPr>
-          <w:p>
-            <w:pPr>
-              <w:jc w:val="center"/>
-              <w:rPr>
-                <w:rFonts w:ascii="Times New Roman" w:hAnsi="Times New Roman" w:cs="Times New Roman"/>
-              </w:rPr>
-            </w:pPr>
-            <w:r>
-              <w:rPr>
-                <w:rFonts w:ascii="Times New Roman" w:hAnsi="Times New Roman" w:cs="Times New Roman"/>
-              </w:rPr>
-              <w:t>0.447 (0.020, 0.875)</w:t>
-            </w:r>
-          </w:p>
-        </w:tc>
-        <w:tc>
-          <w:tcPr>
-            <w:tcW w:w="1080" w:type="dxa"/>
-          </w:tcPr>
-          <w:p>
-            <w:pPr>
-              <w:jc w:val="center"/>
-              <w:rPr>
-                <w:rFonts w:ascii="Times New Roman" w:hAnsi="Times New Roman" w:cs="Times New Roman"/>
-              </w:rPr>
-            </w:pPr>
-            <w:r>
-              <w:rPr>
-                <w:rFonts w:ascii="Times New Roman" w:hAnsi="Times New Roman" w:cs="Times New Roman"/>
-              </w:rPr>
-              <w:t>0.040</w:t>
-            </w:r>
+        <w:trPr>
+          <w:jc w:val="center"/>
+        </w:trPr>
+        <w:tc>
+          <w:tcPr>
+            <w:tcW w:w="2155" w:type="dxa"/>
+          </w:tcPr>
+          <w:p>
+            <w:pPr>
+              <w:jc w:val="center"/>
+              <w:rPr>
+                <w:rFonts w:ascii="Times New Roman" w:hAnsi="Times New Roman" w:cs="Times New Roman"/>
+              </w:rPr>
+            </w:pPr>
+            <w:r>
+              <w:rPr>
+                <w:rFonts w:ascii="Times New Roman" w:hAnsi="Times New Roman" w:cs="Times New Roman"/>
+              </w:rPr>
+              <w:t>[0.3, 0.7]</w:t>
+            </w:r>
+          </w:p>
+        </w:tc>
+        <w:tc>
+          <w:tcPr>
+            <w:tcW w:w="2880" w:type="dxa"/>
+          </w:tcPr>
+          <w:p>
+            <w:pPr>
+              <w:jc w:val="center"/>
+              <w:rPr>
+                <w:rFonts w:ascii="Times New Roman" w:hAnsi="Times New Roman" w:cs="Times New Roman"/>
+              </w:rPr>
+            </w:pPr>
+          </w:p>
+        </w:tc>
+        <w:tc>
+          <w:tcPr>
+            <w:tcW w:w="1710" w:type="dxa"/>
+          </w:tcPr>
+          <w:p>
+            <w:pPr>
+              <w:jc w:val="center"/>
+              <w:rPr>
+                <w:rFonts w:ascii="Times New Roman" w:hAnsi="Times New Roman" w:cs="Times New Roman"/>
+              </w:rPr>
+            </w:pPr>
           </w:p>
         </w:tc>
       </w:tr>
       <w:tr>
-        <w:tc>
-          <w:tcPr>
-            <w:tcW w:w="4585" w:type="dxa"/>
-          </w:tcPr>
-          <w:p>
-            <w:pPr>
-              <w:jc w:val="right"/>
-              <w:rPr>
-                <w:rFonts w:ascii="Times New Roman" w:hAnsi="Times New Roman" w:cs="Times New Roman"/>
-              </w:rPr>
-            </w:pPr>
-            <w:r>
-              <w:rPr>
-                <w:rFonts w:ascii="Times New Roman" w:hAnsi="Times New Roman" w:cs="Times New Roman"/>
-              </w:rPr>
-              <w:t>Fuzzy Regression Discontinuity</w:t>
-            </w:r>
-          </w:p>
-        </w:tc>
-        <w:tc>
-          <w:tcPr>
-            <w:tcW w:w="3780" w:type="dxa"/>
-          </w:tcPr>
-          <w:p>
-            <w:pPr>
-              <w:jc w:val="center"/>
-              <w:rPr>
-                <w:rFonts w:ascii="Times New Roman" w:hAnsi="Times New Roman" w:cs="Times New Roman"/>
-              </w:rPr>
-            </w:pPr>
-            <w:r>
-              <w:rPr>
-                <w:rFonts w:ascii="Times New Roman" w:hAnsi="Times New Roman" w:cs="Times New Roman"/>
-              </w:rPr>
-              <w:t>0.065 (-0.050, 0.510)</w:t>
-            </w:r>
-          </w:p>
-        </w:tc>
-        <w:tc>
-          <w:tcPr>
-            <w:tcW w:w="1080" w:type="dxa"/>
-          </w:tcPr>
-          <w:p>
-            <w:pPr>
-              <w:jc w:val="center"/>
-              <w:rPr>
-                <w:rFonts w:ascii="Times New Roman" w:hAnsi="Times New Roman" w:cs="Times New Roman"/>
-              </w:rPr>
-            </w:pPr>
-            <w:r>
-              <w:rPr>
-                <w:rFonts w:ascii="Times New Roman" w:hAnsi="Times New Roman" w:cs="Times New Roman"/>
-              </w:rPr>
-              <w:t>0.</w:t>
-            </w:r>
-            <w:r>
-              <w:rPr>
-                <w:rFonts w:ascii="Times New Roman" w:hAnsi="Times New Roman" w:cs="Times New Roman"/>
-              </w:rPr>
-              <w:t>138</w:t>
-            </w:r>
+        <w:trPr>
+          <w:jc w:val="center"/>
+        </w:trPr>
+        <w:tc>
+          <w:tcPr>
+            <w:tcW w:w="2155" w:type="dxa"/>
+          </w:tcPr>
+          <w:p>
+            <w:pPr>
+              <w:jc w:val="center"/>
+              <w:rPr>
+                <w:rFonts w:ascii="Times New Roman" w:hAnsi="Times New Roman" w:cs="Times New Roman"/>
+              </w:rPr>
+            </w:pPr>
+            <w:r>
+              <w:rPr>
+                <w:rFonts w:ascii="Times New Roman" w:hAnsi="Times New Roman" w:cs="Times New Roman"/>
+              </w:rPr>
+              <w:lastRenderedPageBreak/>
+              <w:t>[0.2, 0.8]</w:t>
+            </w:r>
+          </w:p>
+        </w:tc>
+        <w:tc>
+          <w:tcPr>
+            <w:tcW w:w="2880" w:type="dxa"/>
+          </w:tcPr>
+          <w:p>
+            <w:pPr>
+              <w:jc w:val="center"/>
+              <w:rPr>
+                <w:rFonts w:ascii="Times New Roman" w:hAnsi="Times New Roman" w:cs="Times New Roman"/>
+              </w:rPr>
+            </w:pPr>
+          </w:p>
+        </w:tc>
+        <w:tc>
+          <w:tcPr>
+            <w:tcW w:w="1710" w:type="dxa"/>
+          </w:tcPr>
+          <w:p>
+            <w:pPr>
+              <w:jc w:val="center"/>
+              <w:rPr>
+                <w:rFonts w:ascii="Times New Roman" w:hAnsi="Times New Roman" w:cs="Times New Roman"/>
+              </w:rPr>
+            </w:pPr>
           </w:p>
         </w:tc>
       </w:tr>
@@ -10048,15 +9532,7 @@
           <w:b/>
           <w:bCs/>
         </w:rPr>
-        <w:t>Results of adjusted logistic regression</w:t>
-      </w:r>
-      <w:r>
-        <w:rPr>
-          <w:rFonts w:ascii="Times New Roman" w:hAnsi="Times New Roman" w:cs="Times New Roman"/>
-          <w:b/>
-          <w:bCs/>
-        </w:rPr>
-        <w:t xml:space="preserve"> and </w:t>
+        <w:t xml:space="preserve">Results of </w:t>
       </w:r>
       <w:r>
         <w:rPr>
@@ -10080,6 +9556,14 @@
           <w:b/>
           <w:bCs/>
         </w:rPr>
+        <w:t xml:space="preserve"> for multiple bandwidths</w:t>
+      </w:r>
+      <w:r>
+        <w:rPr>
+          <w:rFonts w:ascii="Times New Roman" w:hAnsi="Times New Roman" w:cs="Times New Roman"/>
+          <w:b/>
+          <w:bCs/>
+        </w:rPr>
         <w:t xml:space="preserve">, </w:t>
       </w:r>
       <w:r>
@@ -10088,15 +9572,15 @@
           <w:b/>
           <w:bCs/>
         </w:rPr>
-        <w:t>adjusting for prespecified covariates.</w:t>
-      </w:r>
-      <w:r>
-        <w:rPr>
-          <w:rFonts w:ascii="Times New Roman" w:hAnsi="Times New Roman" w:cs="Times New Roman"/>
-          <w:b/>
-          <w:bCs/>
-        </w:rPr>
-        <w:t xml:space="preserve"> Only patients with PD-L1 values in the bandwidth of [0.4, 0.6] were included.</w:t>
+        <w:t>adjusting for prespecified covariates</w:t>
+      </w:r>
+      <w:r>
+        <w:rPr>
+          <w:rFonts w:ascii="Times New Roman" w:hAnsi="Times New Roman" w:cs="Times New Roman"/>
+          <w:b/>
+          <w:bCs/>
+        </w:rPr>
+        <w:t>.</w:t>
       </w:r>
       <w:r>
         <w:rPr>
@@ -10120,15 +9604,47 @@
           <w:b/>
           <w:bCs/>
         </w:rPr>
-        <w:t>are coefficients for IO monotherapy in the adjusted logistic regression and</w:t>
-      </w:r>
-      <w:r>
-        <w:rPr>
-          <w:rFonts w:ascii="Times New Roman" w:hAnsi="Times New Roman" w:cs="Times New Roman"/>
-          <w:b/>
-          <w:bCs/>
-        </w:rPr>
-        <w:t xml:space="preserve"> the intention-to-treat (ITT) statistic in the fuzzy RD model, respectively. ITT reflects the local average treatment effect of </w:t>
+        <w:t xml:space="preserve">are </w:t>
+      </w:r>
+      <w:r>
+        <w:rPr>
+          <w:rFonts w:ascii="Times New Roman" w:hAnsi="Times New Roman" w:cs="Times New Roman"/>
+          <w:b/>
+          <w:bCs/>
+        </w:rPr>
+        <w:t>intention-to-treat (ITT) statistic</w:t>
+      </w:r>
+      <w:r>
+        <w:rPr>
+          <w:rFonts w:ascii="Times New Roman" w:hAnsi="Times New Roman" w:cs="Times New Roman"/>
+          <w:b/>
+          <w:bCs/>
+        </w:rPr>
+        <w:t>s</w:t>
+      </w:r>
+      <w:r>
+        <w:rPr>
+          <w:rFonts w:ascii="Times New Roman" w:hAnsi="Times New Roman" w:cs="Times New Roman"/>
+          <w:b/>
+          <w:bCs/>
+        </w:rPr>
+        <w:t xml:space="preserve"> in the fuzzy RD model</w:t>
+      </w:r>
+      <w:r>
+        <w:rPr>
+          <w:rFonts w:ascii="Times New Roman" w:hAnsi="Times New Roman" w:cs="Times New Roman"/>
+          <w:b/>
+          <w:bCs/>
+        </w:rPr>
+        <w:t xml:space="preserve"> for a given bandwidth.</w:t>
+      </w:r>
+      <w:r>
+        <w:rPr>
+          <w:rFonts w:ascii="Times New Roman" w:hAnsi="Times New Roman" w:cs="Times New Roman"/>
+          <w:b/>
+          <w:bCs/>
+        </w:rPr>
+        <w:t xml:space="preserve"> ITT reflects the local average treatment effect of </w:t>
       </w:r>
       <w:r>
         <w:rPr>
@@ -10307,42 +9823,6 @@
                 <w:rFonts w:ascii="Times New Roman" w:hAnsi="Times New Roman" w:cs="Times New Roman"/>
               </w:rPr>
             </w:pPr>
-            <w:r>
-              <w:rPr>
-                <w:rFonts w:ascii="Times New Roman" w:hAnsi="Times New Roman" w:cs="Times New Roman"/>
-              </w:rPr>
-              <w:t xml:space="preserve">0.704 </w:t>
-            </w:r>
-            <w:r>
-              <w:rPr>
-                <w:rFonts w:ascii="Times New Roman" w:hAnsi="Times New Roman" w:cs="Times New Roman"/>
-              </w:rPr>
-              <w:t>[</w:t>
-            </w:r>
-            <w:r>
-              <w:rPr>
-                <w:rFonts w:ascii="Times New Roman" w:hAnsi="Times New Roman" w:cs="Times New Roman"/>
-              </w:rPr>
-              <w:t>0.693</w:t>
-            </w:r>
-            <w:r>
-              <w:rPr>
-                <w:rFonts w:ascii="Times New Roman" w:hAnsi="Times New Roman" w:cs="Times New Roman"/>
-              </w:rPr>
-              <w:t xml:space="preserve">, </w:t>
-            </w:r>
-            <w:r>
-              <w:rPr>
-                <w:rFonts w:ascii="Times New Roman" w:hAnsi="Times New Roman" w:cs="Times New Roman"/>
-              </w:rPr>
-              <w:t>0.717</w:t>
-            </w:r>
-            <w:r>
-              <w:rPr>
-                <w:rFonts w:ascii="Times New Roman" w:hAnsi="Times New Roman" w:cs="Times New Roman"/>
-              </w:rPr>
-              <w:t>]</w:t>
-            </w:r>
           </w:p>
         </w:tc>
       </w:tr>
@@ -10381,42 +9861,6 @@
                 <w:rFonts w:ascii="Times New Roman" w:hAnsi="Times New Roman" w:cs="Times New Roman"/>
               </w:rPr>
             </w:pPr>
-            <w:r>
-              <w:rPr>
-                <w:rFonts w:ascii="Times New Roman" w:hAnsi="Times New Roman" w:cs="Times New Roman"/>
-              </w:rPr>
-              <w:t xml:space="preserve">0.700 </w:t>
-            </w:r>
-            <w:r>
-              <w:rPr>
-                <w:rFonts w:ascii="Times New Roman" w:hAnsi="Times New Roman" w:cs="Times New Roman"/>
-              </w:rPr>
-              <w:t>[</w:t>
-            </w:r>
-            <w:r>
-              <w:rPr>
-                <w:rFonts w:ascii="Times New Roman" w:hAnsi="Times New Roman" w:cs="Times New Roman"/>
-              </w:rPr>
-              <w:t>0.689</w:t>
-            </w:r>
-            <w:r>
-              <w:rPr>
-                <w:rFonts w:ascii="Times New Roman" w:hAnsi="Times New Roman" w:cs="Times New Roman"/>
-              </w:rPr>
-              <w:t xml:space="preserve">, </w:t>
-            </w:r>
-            <w:r>
-              <w:rPr>
-                <w:rFonts w:ascii="Times New Roman" w:hAnsi="Times New Roman" w:cs="Times New Roman"/>
-              </w:rPr>
-              <w:t>0.711</w:t>
-            </w:r>
-            <w:r>
-              <w:rPr>
-                <w:rFonts w:ascii="Times New Roman" w:hAnsi="Times New Roman" w:cs="Times New Roman"/>
-              </w:rPr>
-              <w:t>]</w:t>
-            </w:r>
           </w:p>
         </w:tc>
       </w:tr>
@@ -10451,42 +9895,6 @@
                 <w:rFonts w:ascii="Times New Roman" w:hAnsi="Times New Roman" w:cs="Times New Roman"/>
               </w:rPr>
             </w:pPr>
-            <w:r>
-              <w:rPr>
-                <w:rFonts w:ascii="Times New Roman" w:hAnsi="Times New Roman" w:cs="Times New Roman"/>
-              </w:rPr>
-              <w:t xml:space="preserve">0.661 </w:t>
-            </w:r>
-            <w:r>
-              <w:rPr>
-                <w:rFonts w:ascii="Times New Roman" w:hAnsi="Times New Roman" w:cs="Times New Roman"/>
-              </w:rPr>
-              <w:t>[</w:t>
-            </w:r>
-            <w:r>
-              <w:rPr>
-                <w:rFonts w:ascii="Times New Roman" w:hAnsi="Times New Roman" w:cs="Times New Roman"/>
-              </w:rPr>
-              <w:t>0.656</w:t>
-            </w:r>
-            <w:r>
-              <w:rPr>
-                <w:rFonts w:ascii="Times New Roman" w:hAnsi="Times New Roman" w:cs="Times New Roman"/>
-              </w:rPr>
-              <w:t xml:space="preserve">, </w:t>
-            </w:r>
-            <w:r>
-              <w:rPr>
-                <w:rFonts w:ascii="Times New Roman" w:hAnsi="Times New Roman" w:cs="Times New Roman"/>
-              </w:rPr>
-              <w:t>0.668</w:t>
-            </w:r>
-            <w:r>
-              <w:rPr>
-                <w:rFonts w:ascii="Times New Roman" w:hAnsi="Times New Roman" w:cs="Times New Roman"/>
-              </w:rPr>
-              <w:t>]</w:t>
-            </w:r>
           </w:p>
         </w:tc>
       </w:tr>
@@ -10515,80 +9923,39 @@
         </w:rPr>
         <w:t>:</w:t>
       </w:r>
-    </w:p>
-    <w:p>
-      <w:pPr>
-        <w:rPr>
-          <w:rFonts w:ascii="Times New Roman" w:hAnsi="Times New Roman" w:cs="Times New Roman"/>
-          <w:b/>
-          <w:bCs/>
-        </w:rPr>
-      </w:pPr>
-    </w:p>
-    <w:p>
-      <w:pPr>
-        <w:rPr>
-          <w:rFonts w:ascii="Times New Roman" w:hAnsi="Times New Roman" w:cs="Times New Roman"/>
-          <w:b/>
-          <w:bCs/>
-        </w:rPr>
-      </w:pPr>
-    </w:p>
-    <w:p>
-      <w:pPr>
-        <w:rPr>
-          <w:rFonts w:ascii="Times New Roman" w:hAnsi="Times New Roman" w:cs="Times New Roman"/>
-        </w:rPr>
-      </w:pPr>
-      <w:r>
-        <w:rPr>
-          <w:rFonts w:ascii="Times New Roman" w:hAnsi="Times New Roman" w:cs="Times New Roman"/>
-          <w:b/>
-          <w:bCs/>
-          <w:noProof/>
-        </w:rPr>
-        <w:drawing>
-          <wp:inline distT="0" distB="0" distL="0" distR="0" wp14:anchorId="025E513D" wp14:editId="3B14DCAB">
-            <wp:extent cx="6290945" cy="4199255"/>
-            <wp:effectExtent l="0" t="0" r="0" b="4445"/>
-            <wp:docPr id="1778022507" name="Picture 8" descr="A graph of a patient's survival&#10;&#10;Description automatically generated"/>
-            <wp:cNvGraphicFramePr>
-              <a:graphicFrameLocks xmlns:a="http://schemas.openxmlformats.org/drawingml/2006/main" noChangeAspect="1"/>
-            </wp:cNvGraphicFramePr>
-            <a:graphic xmlns:a="http://schemas.openxmlformats.org/drawingml/2006/main">
-              <a:graphicData uri="http://schemas.openxmlformats.org/drawingml/2006/picture">
-                <pic:pic xmlns:pic="http://schemas.openxmlformats.org/drawingml/2006/picture">
-                  <pic:nvPicPr>
-                    <pic:cNvPr id="1778022507" name="Picture 8" descr="A graph of a patient's survival&#10;&#10;Description automatically generated"/>
-                    <pic:cNvPicPr/>
-                  </pic:nvPicPr>
-                  <pic:blipFill>
-                    <a:blip r:embed="rId7" cstate="print">
-                      <a:extLst>
-                        <a:ext uri="{28A0092B-C50C-407E-A947-70E740481C1C}">
-                          <a14:useLocalDpi xmlns:a14="http://schemas.microsoft.com/office/drawing/2010/main" val="0"/>
-                        </a:ext>
-                      </a:extLst>
-                    </a:blip>
-                    <a:stretch>
-                      <a:fillRect/>
-                    </a:stretch>
-                  </pic:blipFill>
-                  <pic:spPr>
-                    <a:xfrm>
-                      <a:off x="0" y="0"/>
-                      <a:ext cx="6290945" cy="4199255"/>
-                    </a:xfrm>
-                    <a:prstGeom prst="rect">
-                      <a:avLst/>
-                    </a:prstGeom>
-                  </pic:spPr>
-                </pic:pic>
-              </a:graphicData>
-            </a:graphic>
-          </wp:inline>
-        </w:drawing>
-      </w:r>
+      <w:r>
+        <w:rPr>
+          <w:rFonts w:ascii="Times New Roman" w:hAnsi="Times New Roman" w:cs="Times New Roman"/>
+          <w:b/>
+          <w:bCs/>
+        </w:rPr>
+        <w:t xml:space="preserve"> AUROC for each ML model on the independent test set. AUROC was calculated using 1000 bootstraps. </w:t>
+      </w:r>
+    </w:p>
+    <w:p>
+      <w:pPr>
+        <w:rPr>
+          <w:rFonts w:ascii="Times New Roman" w:hAnsi="Times New Roman" w:cs="Times New Roman"/>
+          <w:b/>
+          <w:bCs/>
+        </w:rPr>
+      </w:pPr>
+    </w:p>
+    <w:p>
+      <w:pPr>
+        <w:rPr>
+          <w:rFonts w:ascii="Times New Roman" w:hAnsi="Times New Roman" w:cs="Times New Roman"/>
+          <w:b/>
+          <w:bCs/>
+        </w:rPr>
+      </w:pPr>
+    </w:p>
+    <w:p>
+      <w:pPr>
+        <w:rPr>
+          <w:rFonts w:ascii="Times New Roman" w:hAnsi="Times New Roman" w:cs="Times New Roman"/>
+        </w:rPr>
+      </w:pPr>
       <w:r>
         <w:rPr>
           <w:rFonts w:ascii="Times New Roman" w:hAnsi="Times New Roman" w:cs="Times New Roman"/>
@@ -10875,12 +10242,6 @@
                 <w:rFonts w:ascii="Times New Roman" w:hAnsi="Times New Roman" w:cs="Times New Roman"/>
               </w:rPr>
             </w:pPr>
-            <w:r>
-              <w:rPr>
-                <w:rFonts w:ascii="Times New Roman" w:hAnsi="Times New Roman" w:cs="Times New Roman"/>
-              </w:rPr>
-              <w:t>292</w:t>
-            </w:r>
           </w:p>
         </w:tc>
         <w:tc>
@@ -10894,12 +10255,6 @@
                 <w:rFonts w:ascii="Times New Roman" w:hAnsi="Times New Roman" w:cs="Times New Roman"/>
               </w:rPr>
             </w:pPr>
-            <w:r>
-              <w:rPr>
-                <w:rFonts w:ascii="Times New Roman" w:hAnsi="Times New Roman" w:cs="Times New Roman"/>
-              </w:rPr>
-              <w:t>427</w:t>
-            </w:r>
           </w:p>
         </w:tc>
         <w:tc>
@@ -10913,12 +10268,6 @@
                 <w:rFonts w:ascii="Times New Roman" w:hAnsi="Times New Roman" w:cs="Times New Roman"/>
               </w:rPr>
             </w:pPr>
-            <w:r>
-              <w:rPr>
-                <w:rFonts w:ascii="Times New Roman" w:hAnsi="Times New Roman" w:cs="Times New Roman"/>
-              </w:rPr>
-              <w:t>4.08 [3.14, 5.32]</w:t>
-            </w:r>
           </w:p>
         </w:tc>
         <w:tc>
@@ -10932,12 +10281,6 @@
                 <w:rFonts w:ascii="Times New Roman" w:hAnsi="Times New Roman" w:cs="Times New Roman"/>
               </w:rPr>
             </w:pPr>
-            <w:r>
-              <w:rPr>
-                <w:rFonts w:ascii="Times New Roman" w:hAnsi="Times New Roman" w:cs="Times New Roman"/>
-              </w:rPr>
-              <w:t>&lt;0.001</w:t>
-            </w:r>
           </w:p>
         </w:tc>
       </w:tr>
@@ -10972,12 +10315,6 @@
                 <w:rFonts w:ascii="Times New Roman" w:hAnsi="Times New Roman" w:cs="Times New Roman"/>
               </w:rPr>
             </w:pPr>
-            <w:r>
-              <w:rPr>
-                <w:rFonts w:ascii="Times New Roman" w:hAnsi="Times New Roman" w:cs="Times New Roman"/>
-              </w:rPr>
-              <w:t>219</w:t>
-            </w:r>
           </w:p>
         </w:tc>
         <w:tc>
@@ -10991,12 +10328,6 @@
                 <w:rFonts w:ascii="Times New Roman" w:hAnsi="Times New Roman" w:cs="Times New Roman"/>
               </w:rPr>
             </w:pPr>
-            <w:r>
-              <w:rPr>
-                <w:rFonts w:ascii="Times New Roman" w:hAnsi="Times New Roman" w:cs="Times New Roman"/>
-              </w:rPr>
-              <w:t>356</w:t>
-            </w:r>
           </w:p>
         </w:tc>
         <w:tc>
@@ -11010,12 +10341,6 @@
                 <w:rFonts w:ascii="Times New Roman" w:hAnsi="Times New Roman" w:cs="Times New Roman"/>
               </w:rPr>
             </w:pPr>
-            <w:r>
-              <w:rPr>
-                <w:rFonts w:ascii="Times New Roman" w:hAnsi="Times New Roman" w:cs="Times New Roman"/>
-              </w:rPr>
-              <w:t>4.25[3.13, 5.77]</w:t>
-            </w:r>
           </w:p>
         </w:tc>
         <w:tc>
@@ -11029,12 +10354,6 @@
                 <w:rFonts w:ascii="Times New Roman" w:hAnsi="Times New Roman" w:cs="Times New Roman"/>
               </w:rPr>
             </w:pPr>
-            <w:r>
-              <w:rPr>
-                <w:rFonts w:ascii="Times New Roman" w:hAnsi="Times New Roman" w:cs="Times New Roman"/>
-              </w:rPr>
-              <w:t>&lt;0.001</w:t>
-            </w:r>
           </w:p>
         </w:tc>
       </w:tr>
@@ -11069,12 +10388,6 @@
                 <w:rFonts w:ascii="Times New Roman" w:hAnsi="Times New Roman" w:cs="Times New Roman"/>
               </w:rPr>
             </w:pPr>
-            <w:r>
-              <w:rPr>
-                <w:rFonts w:ascii="Times New Roman" w:hAnsi="Times New Roman" w:cs="Times New Roman"/>
-              </w:rPr>
-              <w:t>73</w:t>
-            </w:r>
           </w:p>
         </w:tc>
         <w:tc>
@@ -11083,17 +10396,10 @@
           </w:tcPr>
           <w:p>
             <w:pPr>
-              <w:jc w:val="center"/>
-              <w:rPr>
-                <w:rFonts w:ascii="Times New Roman" w:hAnsi="Times New Roman" w:cs="Times New Roman"/>
-              </w:rPr>
-            </w:pPr>
-            <w:r>
-              <w:rPr>
-                <w:rFonts w:ascii="Times New Roman" w:hAnsi="Times New Roman" w:cs="Times New Roman"/>
-              </w:rPr>
-              <w:t>71</w:t>
-            </w:r>
+              <w:rPr>
+                <w:rFonts w:ascii="Times New Roman" w:hAnsi="Times New Roman" w:cs="Times New Roman"/>
+              </w:rPr>
+            </w:pPr>
           </w:p>
         </w:tc>
         <w:tc>
@@ -11107,12 +10413,6 @@
                 <w:rFonts w:ascii="Times New Roman" w:hAnsi="Times New Roman" w:cs="Times New Roman"/>
               </w:rPr>
             </w:pPr>
-            <w:r>
-              <w:rPr>
-                <w:rFonts w:ascii="Times New Roman" w:hAnsi="Times New Roman" w:cs="Times New Roman"/>
-              </w:rPr>
-              <w:t>3.60 [2.11, 6.17]</w:t>
-            </w:r>
           </w:p>
         </w:tc>
         <w:tc>
@@ -11126,12 +10426,6 @@
                 <w:rFonts w:ascii="Times New Roman" w:hAnsi="Times New Roman" w:cs="Times New Roman"/>
               </w:rPr>
             </w:pPr>
-            <w:r>
-              <w:rPr>
-                <w:rFonts w:ascii="Times New Roman" w:hAnsi="Times New Roman" w:cs="Times New Roman"/>
-              </w:rPr>
-              <w:t>&lt;0.001</w:t>
-            </w:r>
           </w:p>
         </w:tc>
       </w:tr>
@@ -11179,17 +10473,10 @@
           </w:tcPr>
           <w:p>
             <w:pPr>
-              <w:jc w:val="center"/>
-              <w:rPr>
-                <w:rFonts w:ascii="Times New Roman" w:hAnsi="Times New Roman" w:cs="Times New Roman"/>
-              </w:rPr>
-            </w:pPr>
-            <w:r>
-              <w:rPr>
-                <w:rFonts w:ascii="Times New Roman" w:hAnsi="Times New Roman" w:cs="Times New Roman"/>
-              </w:rPr>
-              <w:t>27</w:t>
-            </w:r>
+              <w:rPr>
+                <w:rFonts w:ascii="Times New Roman" w:hAnsi="Times New Roman" w:cs="Times New Roman"/>
+              </w:rPr>
+            </w:pPr>
           </w:p>
         </w:tc>
         <w:tc>
@@ -11203,12 +10490,6 @@
                 <w:rFonts w:ascii="Times New Roman" w:hAnsi="Times New Roman" w:cs="Times New Roman"/>
               </w:rPr>
             </w:pPr>
-            <w:r>
-              <w:rPr>
-                <w:rFonts w:ascii="Times New Roman" w:hAnsi="Times New Roman" w:cs="Times New Roman"/>
-              </w:rPr>
-              <w:t>21</w:t>
-            </w:r>
           </w:p>
         </w:tc>
         <w:tc>
@@ -11222,12 +10503,6 @@
                 <w:rFonts w:ascii="Times New Roman" w:hAnsi="Times New Roman" w:cs="Times New Roman"/>
               </w:rPr>
             </w:pPr>
-            <w:r>
-              <w:rPr>
-                <w:rFonts w:ascii="Times New Roman" w:hAnsi="Times New Roman" w:cs="Times New Roman"/>
-              </w:rPr>
-              <w:t>4.27 [1.73, 10.56]</w:t>
-            </w:r>
           </w:p>
         </w:tc>
         <w:tc>
@@ -11241,12 +10516,6 @@
                 <w:rFonts w:ascii="Times New Roman" w:hAnsi="Times New Roman" w:cs="Times New Roman"/>
               </w:rPr>
             </w:pPr>
-            <w:r>
-              <w:rPr>
-                <w:rFonts w:ascii="Times New Roman" w:hAnsi="Times New Roman" w:cs="Times New Roman"/>
-              </w:rPr>
-              <w:t>0.002</w:t>
-            </w:r>
           </w:p>
         </w:tc>
       </w:tr>
@@ -11356,7 +10625,6 @@
           <w:b/>
           <w:bCs/>
         </w:rPr>
-        <w:lastRenderedPageBreak/>
         <w:t>Conclusion</w:t>
       </w:r>
     </w:p>
@@ -11564,7 +10832,7 @@
         </w:rPr>
         <w:t xml:space="preserve">Development of the ML model was done in Python v3.8.10 and required the following packages: ***. Statistical analysis was done in Stata. Code is available on GitHub at </w:t>
       </w:r>
-      <w:hyperlink r:id="rId8" w:history="1">
+      <w:hyperlink r:id="rId6" w:history="1">
         <w:r>
           <w:rPr>
             <w:rStyle w:val="Hyperlink"/>
@@ -11592,7 +10860,7 @@
         </w:rPr>
         <w:t xml:space="preserve">For any further inquiries please contact </w:t>
       </w:r>
-      <w:hyperlink r:id="rId9" w:history="1">
+      <w:hyperlink r:id="rId7" w:history="1">
         <w:r>
           <w:rPr>
             <w:rStyle w:val="Hyperlink"/>
@@ -11919,14 +11187,7 @@
         <w:rPr>
           <w:rFonts w:ascii="Times New Roman" w:hAnsi="Times New Roman" w:cs="Times New Roman"/>
         </w:rPr>
-        <w:t xml:space="preserve">. 2016;375(19):1823-1833. </w:t>
-      </w:r>
-      <w:r>
-        <w:rPr>
-          <w:rFonts w:ascii="Times New Roman" w:hAnsi="Times New Roman" w:cs="Times New Roman"/>
-        </w:rPr>
-        <w:lastRenderedPageBreak/>
-        <w:t>doi:10.1056/NEJMoa1606774</w:t>
+        <w:t>. 2016;375(19):1823-1833. doi:10.1056/NEJMoa1606774</w:t>
       </w:r>
     </w:p>
     <w:p>
@@ -11982,7 +11243,14 @@
           <w:rFonts w:ascii="Times New Roman" w:hAnsi="Times New Roman" w:cs="Times New Roman"/>
         </w:rPr>
         <w:tab/>
-        <w:t xml:space="preserve">Di Federico A, De Giglio A, Parisi C, Gelsomino F, Ardizzoni A. PD-1/PD-L1 inhibitor monotherapy or in combination with chemotherapy as upfront treatment for advanced NSCLC with PD-L1 expression ≥ 50%: Selecting the best strategy. </w:t>
+        <w:t xml:space="preserve">Di Federico A, De Giglio A, Parisi C, Gelsomino F, Ardizzoni A. PD-1/PD-L1 inhibitor </w:t>
+      </w:r>
+      <w:r>
+        <w:rPr>
+          <w:rFonts w:ascii="Times New Roman" w:hAnsi="Times New Roman" w:cs="Times New Roman"/>
+        </w:rPr>
+        <w:lastRenderedPageBreak/>
+        <w:t xml:space="preserve">monotherapy or in combination with chemotherapy as upfront treatment for advanced NSCLC with PD-L1 expression ≥ 50%: Selecting the best strategy. </w:t>
       </w:r>
       <w:r>
         <w:rPr>
@@ -12378,14 +11646,7 @@
           <w:rFonts w:ascii="Times New Roman" w:hAnsi="Times New Roman" w:cs="Times New Roman"/>
         </w:rPr>
         <w:tab/>
-        <w:t xml:space="preserve">Rakaee M, Adib E, Ricciuti B, et al. Association of Machine Learning-Based Assessment of </w:t>
-      </w:r>
-      <w:r>
-        <w:rPr>
-          <w:rFonts w:ascii="Times New Roman" w:hAnsi="Times New Roman" w:cs="Times New Roman"/>
-        </w:rPr>
-        <w:lastRenderedPageBreak/>
-        <w:t xml:space="preserve">Tumor-Infiltrating Lymphocytes on Standard Histologic Images With Outcomes of Immunotherapy in Patients With NSCLC. </w:t>
+        <w:t xml:space="preserve">Rakaee M, Adib E, Ricciuti B, et al. Association of Machine Learning-Based Assessment of Tumor-Infiltrating Lymphocytes on Standard Histologic Images With Outcomes of Immunotherapy in Patients With NSCLC. </w:t>
       </w:r>
       <w:r>
         <w:rPr>
@@ -12441,7 +11702,14 @@
           <w:rFonts w:ascii="Times New Roman" w:hAnsi="Times New Roman" w:cs="Times New Roman"/>
         </w:rPr>
         <w:tab/>
-        <w:t xml:space="preserve">Oken MM, Creech RH, Tormey DC, et al. Toxicity and response criteria of the Eastern Cooperative Oncology Group. </w:t>
+        <w:t xml:space="preserve">Oken MM, Creech RH, Tormey DC, et al. Toxicity and response criteria of the Eastern </w:t>
+      </w:r>
+      <w:r>
+        <w:rPr>
+          <w:rFonts w:ascii="Times New Roman" w:hAnsi="Times New Roman" w:cs="Times New Roman"/>
+        </w:rPr>
+        <w:lastRenderedPageBreak/>
+        <w:t xml:space="preserve">Cooperative Oncology Group. </w:t>
       </w:r>
       <w:r>
         <w:rPr>

</xml_diff>